<commit_message>
Refactor SPP document handling and validation
- Introduced a new workflow routing module to manage document validation and generation based on stable document IDs.
- Updated the main application logic to utilize the new routing for validating document inputs and generating outputs.
- Modified SPP and SPP Termin 2 modules to align with the new validation schema, including renaming input columns for consistency.
- Enhanced test coverage for SPP and SPP Termin 2 to ensure correct handling of new input names and validation logic.
- Updated Excel input files to reflect changes in expected column names.
</commit_message>
<xml_diff>
--- a/template/04. Template SPP T2 PML.docx
+++ b/template/04. Template SPP T2 PML.docx
@@ -90,7 +90,6 @@
           <w:szCs w:val="24"/>
         </w:rPr>
       </w:pPr>
-      <w:proofErr w:type="spellStart"/>
       <w:r>
         <w:rPr>
           <w:rFonts w:ascii="Bookman Old Style" w:eastAsia="Bookman Old Style" w:hAnsi="Bookman Old Style" w:cs="Bookman Old Style"/>
@@ -98,44 +97,34 @@
           <w:sz w:val="24"/>
           <w:szCs w:val="24"/>
         </w:rPr>
-        <w:t>Nomor</w:t>
-      </w:r>
-      <w:proofErr w:type="spellEnd"/>
-      <w:r>
-        <w:rPr>
-          <w:rFonts w:ascii="Bookman Old Style" w:eastAsia="Bookman Old Style" w:hAnsi="Bookman Old Style" w:cs="Bookman Old Style"/>
-          <w:color w:val="000000"/>
-          <w:sz w:val="24"/>
-          <w:szCs w:val="24"/>
-        </w:rPr>
-        <w:t xml:space="preserve">: </w:t>
-      </w:r>
-      <w:r>
-        <w:rPr>
-          <w:rFonts w:ascii="Bookman Old Style" w:eastAsia="Bookman Old Style" w:hAnsi="Bookman Old Style" w:cs="Bookman Old Style"/>
-          <w:color w:val="FF0000"/>
-          <w:sz w:val="24"/>
-          <w:szCs w:val="24"/>
-        </w:rPr>
-        <w:t>{{no_urut_spp</w:t>
-      </w:r>
-      <w:r>
-        <w:rPr>
-          <w:rFonts w:ascii="Bookman Old Style" w:eastAsia="Bookman Old Style" w:hAnsi="Bookman Old Style" w:cs="Bookman Old Style"/>
-          <w:color w:val="FF0000"/>
-          <w:sz w:val="24"/>
-          <w:szCs w:val="24"/>
-        </w:rPr>
-        <w:t>_t2</w:t>
-      </w:r>
-      <w:r>
-        <w:rPr>
-          <w:rFonts w:ascii="Bookman Old Style" w:eastAsia="Bookman Old Style" w:hAnsi="Bookman Old Style" w:cs="Bookman Old Style"/>
-          <w:color w:val="FF0000"/>
-          <w:sz w:val="24"/>
-          <w:szCs w:val="24"/>
-        </w:rPr>
-        <w:t>}}</w:t>
+        <w:t xml:space="preserve">Nomor: </w:t>
+      </w:r>
+      <w:r>
+        <w:rPr>
+          <w:rFonts w:ascii="Bookman Old Style" w:eastAsia="Bookman Old Style" w:hAnsi="Bookman Old Style" w:cs="Bookman Old Style"/>
+          <w:color w:val="EE0000"/>
+          <w:sz w:val="24"/>
+          <w:szCs w:val="24"/>
+        </w:rPr>
+        <w:t>{{no_</w:t>
+      </w:r>
+      <w:r>
+        <w:rPr>
+          <w:rFonts w:ascii="Bookman Old Style" w:eastAsia="Bookman Old Style" w:hAnsi="Bookman Old Style" w:cs="Bookman Old Style"/>
+          <w:color w:val="EE0000"/>
+          <w:sz w:val="24"/>
+          <w:szCs w:val="24"/>
+        </w:rPr>
+        <w:t>urut</w:t>
+      </w:r>
+      <w:r>
+        <w:rPr>
+          <w:rFonts w:ascii="Bookman Old Style" w:eastAsia="Bookman Old Style" w:hAnsi="Bookman Old Style" w:cs="Bookman Old Style"/>
+          <w:color w:val="EE0000"/>
+          <w:sz w:val="24"/>
+          <w:szCs w:val="24"/>
+        </w:rPr>
+        <w:t>_spp_t2}}</w:t>
       </w:r>
       <w:r>
         <w:rPr>
@@ -174,87 +163,7 @@
           <w:sz w:val="24"/>
           <w:szCs w:val="24"/>
         </w:rPr>
-        <w:t xml:space="preserve">Yang </w:t>
-      </w:r>
-      <w:proofErr w:type="spellStart"/>
-      <w:r>
-        <w:rPr>
-          <w:rFonts w:ascii="Bookman Old Style" w:eastAsia="Bookman Old Style" w:hAnsi="Bookman Old Style" w:cs="Bookman Old Style"/>
-          <w:color w:val="000000"/>
-          <w:sz w:val="24"/>
-          <w:szCs w:val="24"/>
-        </w:rPr>
-        <w:t>bertanda</w:t>
-      </w:r>
-      <w:proofErr w:type="spellEnd"/>
-      <w:r>
-        <w:rPr>
-          <w:rFonts w:ascii="Bookman Old Style" w:eastAsia="Bookman Old Style" w:hAnsi="Bookman Old Style" w:cs="Bookman Old Style"/>
-          <w:color w:val="000000"/>
-          <w:sz w:val="24"/>
-          <w:szCs w:val="24"/>
-        </w:rPr>
-        <w:t xml:space="preserve"> </w:t>
-      </w:r>
-      <w:proofErr w:type="spellStart"/>
-      <w:r>
-        <w:rPr>
-          <w:rFonts w:ascii="Bookman Old Style" w:eastAsia="Bookman Old Style" w:hAnsi="Bookman Old Style" w:cs="Bookman Old Style"/>
-          <w:color w:val="000000"/>
-          <w:sz w:val="24"/>
-          <w:szCs w:val="24"/>
-        </w:rPr>
-        <w:t>tangan</w:t>
-      </w:r>
-      <w:proofErr w:type="spellEnd"/>
-      <w:r>
-        <w:rPr>
-          <w:rFonts w:ascii="Bookman Old Style" w:eastAsia="Bookman Old Style" w:hAnsi="Bookman Old Style" w:cs="Bookman Old Style"/>
-          <w:color w:val="000000"/>
-          <w:sz w:val="24"/>
-          <w:szCs w:val="24"/>
-        </w:rPr>
-        <w:t xml:space="preserve"> di </w:t>
-      </w:r>
-      <w:proofErr w:type="spellStart"/>
-      <w:r>
-        <w:rPr>
-          <w:rFonts w:ascii="Bookman Old Style" w:eastAsia="Bookman Old Style" w:hAnsi="Bookman Old Style" w:cs="Bookman Old Style"/>
-          <w:color w:val="000000"/>
-          <w:sz w:val="24"/>
-          <w:szCs w:val="24"/>
-        </w:rPr>
-        <w:t>bawah</w:t>
-      </w:r>
-      <w:proofErr w:type="spellEnd"/>
-      <w:r>
-        <w:rPr>
-          <w:rFonts w:ascii="Bookman Old Style" w:eastAsia="Bookman Old Style" w:hAnsi="Bookman Old Style" w:cs="Bookman Old Style"/>
-          <w:color w:val="000000"/>
-          <w:sz w:val="24"/>
-          <w:szCs w:val="24"/>
-        </w:rPr>
-        <w:t xml:space="preserve"> </w:t>
-      </w:r>
-      <w:proofErr w:type="spellStart"/>
-      <w:r>
-        <w:rPr>
-          <w:rFonts w:ascii="Bookman Old Style" w:eastAsia="Bookman Old Style" w:hAnsi="Bookman Old Style" w:cs="Bookman Old Style"/>
-          <w:color w:val="000000"/>
-          <w:sz w:val="24"/>
-          <w:szCs w:val="24"/>
-        </w:rPr>
-        <w:t>ini</w:t>
-      </w:r>
-      <w:proofErr w:type="spellEnd"/>
-      <w:r>
-        <w:rPr>
-          <w:rFonts w:ascii="Bookman Old Style" w:eastAsia="Bookman Old Style" w:hAnsi="Bookman Old Style" w:cs="Bookman Old Style"/>
-          <w:color w:val="000000"/>
-          <w:sz w:val="24"/>
-          <w:szCs w:val="24"/>
-        </w:rPr>
-        <w:t>:</w:t>
+        <w:t>Yang bertanda tangan di bawah ini:</w:t>
       </w:r>
     </w:p>
     <w:p>
@@ -299,27 +208,7 @@
           <w:sz w:val="24"/>
           <w:szCs w:val="24"/>
         </w:rPr>
-        <w:t>{{</w:t>
-      </w:r>
-      <w:proofErr w:type="spellStart"/>
-      <w:r>
-        <w:rPr>
-          <w:rFonts w:ascii="Bookman Old Style" w:eastAsia="Bookman Old Style" w:hAnsi="Bookman Old Style" w:cs="Bookman Old Style"/>
-          <w:color w:val="FF0000"/>
-          <w:sz w:val="24"/>
-          <w:szCs w:val="24"/>
-        </w:rPr>
-        <w:t>nama_lengkap</w:t>
-      </w:r>
-      <w:proofErr w:type="spellEnd"/>
-      <w:r>
-        <w:rPr>
-          <w:rFonts w:ascii="Bookman Old Style" w:eastAsia="Bookman Old Style" w:hAnsi="Bookman Old Style" w:cs="Bookman Old Style"/>
-          <w:color w:val="FF0000"/>
-          <w:sz w:val="24"/>
-          <w:szCs w:val="24"/>
-        </w:rPr>
-        <w:t>}}</w:t>
+        <w:t>{{nama_lengkap}}</w:t>
       </w:r>
     </w:p>
     <w:p>
@@ -365,27 +254,7 @@
           <w:sz w:val="24"/>
           <w:szCs w:val="24"/>
         </w:rPr>
-        <w:t>{{</w:t>
-      </w:r>
-      <w:proofErr w:type="spellStart"/>
-      <w:r>
-        <w:rPr>
-          <w:rFonts w:ascii="Bookman Old Style" w:eastAsia="Bookman Old Style" w:hAnsi="Bookman Old Style" w:cs="Bookman Old Style"/>
-          <w:color w:val="FF0000"/>
-          <w:sz w:val="24"/>
-          <w:szCs w:val="24"/>
-        </w:rPr>
-        <w:t>nik</w:t>
-      </w:r>
-      <w:proofErr w:type="spellEnd"/>
-      <w:r>
-        <w:rPr>
-          <w:rFonts w:ascii="Bookman Old Style" w:eastAsia="Bookman Old Style" w:hAnsi="Bookman Old Style" w:cs="Bookman Old Style"/>
-          <w:color w:val="FF0000"/>
-          <w:sz w:val="24"/>
-          <w:szCs w:val="24"/>
-        </w:rPr>
-        <w:t>}}</w:t>
+        <w:t>{{nik}}</w:t>
       </w:r>
     </w:p>
     <w:p>
@@ -405,23 +274,13 @@
           <w:szCs w:val="24"/>
         </w:rPr>
       </w:pPr>
-      <w:proofErr w:type="spellStart"/>
-      <w:r>
-        <w:rPr>
-          <w:rFonts w:ascii="Bookman Old Style" w:eastAsia="Bookman Old Style" w:hAnsi="Bookman Old Style" w:cs="Bookman Old Style"/>
-          <w:sz w:val="24"/>
-          <w:szCs w:val="24"/>
-        </w:rPr>
-        <w:t>Jabatan</w:t>
-      </w:r>
-      <w:proofErr w:type="spellEnd"/>
-      <w:r>
-        <w:rPr>
-          <w:rFonts w:ascii="Bookman Old Style" w:eastAsia="Bookman Old Style" w:hAnsi="Bookman Old Style" w:cs="Bookman Old Style"/>
-          <w:sz w:val="24"/>
-          <w:szCs w:val="24"/>
-        </w:rPr>
-        <w:t xml:space="preserve"> </w:t>
+      <w:r>
+        <w:rPr>
+          <w:rFonts w:ascii="Bookman Old Style" w:eastAsia="Bookman Old Style" w:hAnsi="Bookman Old Style" w:cs="Bookman Old Style"/>
+          <w:sz w:val="24"/>
+          <w:szCs w:val="24"/>
+        </w:rPr>
+        <w:t xml:space="preserve">Jabatan </w:t>
       </w:r>
       <w:r>
         <w:rPr>
@@ -430,25 +289,7 @@
           <w:szCs w:val="24"/>
         </w:rPr>
         <w:tab/>
-        <w:t xml:space="preserve">: </w:t>
-      </w:r>
-      <w:proofErr w:type="spellStart"/>
-      <w:r>
-        <w:rPr>
-          <w:rFonts w:ascii="Bookman Old Style" w:eastAsia="Bookman Old Style" w:hAnsi="Bookman Old Style" w:cs="Bookman Old Style"/>
-          <w:sz w:val="24"/>
-          <w:szCs w:val="24"/>
-        </w:rPr>
-        <w:t>Pemeriksa</w:t>
-      </w:r>
-      <w:proofErr w:type="spellEnd"/>
-      <w:r>
-        <w:rPr>
-          <w:rFonts w:ascii="Bookman Old Style" w:eastAsia="Bookman Old Style" w:hAnsi="Bookman Old Style" w:cs="Bookman Old Style"/>
-          <w:sz w:val="24"/>
-          <w:szCs w:val="24"/>
-        </w:rPr>
-        <w:t xml:space="preserve"> Lapangan Sensus Ekonomi 2026</w:t>
+        <w:t>: Pemeriksa Lapangan Sensus Ekonomi 2026</w:t>
       </w:r>
     </w:p>
     <w:p>
@@ -471,7 +312,6 @@
           <w:szCs w:val="24"/>
         </w:rPr>
       </w:pPr>
-      <w:proofErr w:type="spellStart"/>
       <w:r>
         <w:rPr>
           <w:rFonts w:ascii="Bookman Old Style" w:eastAsia="Bookman Old Style" w:hAnsi="Bookman Old Style" w:cs="Bookman Old Style"/>
@@ -479,57 +319,7 @@
           <w:sz w:val="24"/>
           <w:szCs w:val="24"/>
         </w:rPr>
-        <w:t>Dengan</w:t>
-      </w:r>
-      <w:proofErr w:type="spellEnd"/>
-      <w:r>
-        <w:rPr>
-          <w:rFonts w:ascii="Bookman Old Style" w:eastAsia="Bookman Old Style" w:hAnsi="Bookman Old Style" w:cs="Bookman Old Style"/>
-          <w:color w:val="000000"/>
-          <w:sz w:val="24"/>
-          <w:szCs w:val="24"/>
-        </w:rPr>
-        <w:t xml:space="preserve"> </w:t>
-      </w:r>
-      <w:proofErr w:type="spellStart"/>
-      <w:r>
-        <w:rPr>
-          <w:rFonts w:ascii="Bookman Old Style" w:eastAsia="Bookman Old Style" w:hAnsi="Bookman Old Style" w:cs="Bookman Old Style"/>
-          <w:color w:val="000000"/>
-          <w:sz w:val="24"/>
-          <w:szCs w:val="24"/>
-        </w:rPr>
-        <w:t>ini</w:t>
-      </w:r>
-      <w:proofErr w:type="spellEnd"/>
-      <w:r>
-        <w:rPr>
-          <w:rFonts w:ascii="Bookman Old Style" w:eastAsia="Bookman Old Style" w:hAnsi="Bookman Old Style" w:cs="Bookman Old Style"/>
-          <w:color w:val="000000"/>
-          <w:sz w:val="24"/>
-          <w:szCs w:val="24"/>
-        </w:rPr>
-        <w:t xml:space="preserve"> </w:t>
-      </w:r>
-      <w:proofErr w:type="spellStart"/>
-      <w:r>
-        <w:rPr>
-          <w:rFonts w:ascii="Bookman Old Style" w:eastAsia="Bookman Old Style" w:hAnsi="Bookman Old Style" w:cs="Bookman Old Style"/>
-          <w:color w:val="000000"/>
-          <w:sz w:val="24"/>
-          <w:szCs w:val="24"/>
-        </w:rPr>
-        <w:t>menyatakan</w:t>
-      </w:r>
-      <w:proofErr w:type="spellEnd"/>
-      <w:r>
-        <w:rPr>
-          <w:rFonts w:ascii="Bookman Old Style" w:eastAsia="Bookman Old Style" w:hAnsi="Bookman Old Style" w:cs="Bookman Old Style"/>
-          <w:color w:val="000000"/>
-          <w:sz w:val="24"/>
-          <w:szCs w:val="24"/>
-        </w:rPr>
-        <w:t>:  </w:t>
+        <w:t>Dengan ini menyatakan:  </w:t>
       </w:r>
     </w:p>
     <w:p>
@@ -548,32 +338,13 @@
           <w:szCs w:val="24"/>
         </w:rPr>
       </w:pPr>
-      <w:proofErr w:type="spellStart"/>
-      <w:r>
-        <w:rPr>
-          <w:rFonts w:ascii="Bookman Old Style" w:eastAsia="Bookman Old Style" w:hAnsi="Bookman Old Style" w:cs="Bookman Old Style"/>
-          <w:sz w:val="24"/>
-          <w:szCs w:val="24"/>
-        </w:rPr>
-        <w:t>bahwa</w:t>
-      </w:r>
-      <w:proofErr w:type="spellEnd"/>
-      <w:r>
-        <w:rPr>
-          <w:rFonts w:ascii="Bookman Old Style" w:eastAsia="Bookman Old Style" w:hAnsi="Bookman Old Style" w:cs="Bookman Old Style"/>
-          <w:sz w:val="24"/>
-          <w:szCs w:val="24"/>
-        </w:rPr>
-        <w:t xml:space="preserve"> </w:t>
-      </w:r>
-      <w:proofErr w:type="spellStart"/>
-      <w:r>
-        <w:rPr>
-          <w:rFonts w:ascii="Bookman Old Style" w:eastAsia="Bookman Old Style" w:hAnsi="Bookman Old Style" w:cs="Bookman Old Style"/>
-          <w:sz w:val="24"/>
-          <w:szCs w:val="24"/>
-        </w:rPr>
-        <w:t>t</w:t>
+      <w:r>
+        <w:rPr>
+          <w:rFonts w:ascii="Bookman Old Style" w:eastAsia="Bookman Old Style" w:hAnsi="Bookman Old Style" w:cs="Bookman Old Style"/>
+          <w:sz w:val="24"/>
+          <w:szCs w:val="24"/>
+        </w:rPr>
+        <w:t>bahwa t</w:t>
       </w:r>
       <w:r>
         <w:rPr>
@@ -582,9 +353,17 @@
           <w:sz w:val="24"/>
           <w:szCs w:val="24"/>
         </w:rPr>
-        <w:t>elah</w:t>
-      </w:r>
-      <w:proofErr w:type="spellEnd"/>
+        <w:t xml:space="preserve">elah melaksanakan pekerjaan Pemeriksaan hasil Pendataan Lapangan Sensus Ekonomi 2026 pada Badan Pusat Statistik </w:t>
+      </w:r>
+      <w:r>
+        <w:rPr>
+          <w:rFonts w:ascii="Bookman Old Style" w:eastAsia="Bookman Old Style" w:hAnsi="Bookman Old Style" w:cs="Bookman Old Style"/>
+          <w:color w:val="0000FF"/>
+          <w:sz w:val="24"/>
+          <w:szCs w:val="24"/>
+        </w:rPr>
+        <w:t>Kabupaten Barito Kuala</w:t>
+      </w:r>
       <w:r>
         <w:rPr>
           <w:rFonts w:ascii="Bookman Old Style" w:eastAsia="Bookman Old Style" w:hAnsi="Bookman Old Style" w:cs="Bookman Old Style"/>
@@ -592,9 +371,17 @@
           <w:sz w:val="24"/>
           <w:szCs w:val="24"/>
         </w:rPr>
-        <w:t xml:space="preserve"> </w:t>
-      </w:r>
-      <w:proofErr w:type="spellStart"/>
+        <w:t xml:space="preserve"> berdasarkan Perjanjian Kerja Nomor: </w:t>
+      </w:r>
+      <w:r>
+        <w:rPr>
+          <w:rFonts w:ascii="Bookman Old Style" w:eastAsia="Bookman Old Style" w:hAnsi="Bookman Old Style" w:cs="Bookman Old Style"/>
+          <w:color w:val="FF0000"/>
+          <w:sz w:val="24"/>
+          <w:szCs w:val="24"/>
+        </w:rPr>
+        <w:t>{{no_spk}}</w:t>
+      </w:r>
       <w:r>
         <w:rPr>
           <w:rFonts w:ascii="Bookman Old Style" w:eastAsia="Bookman Old Style" w:hAnsi="Bookman Old Style" w:cs="Bookman Old Style"/>
@@ -602,324 +389,7 @@
           <w:sz w:val="24"/>
           <w:szCs w:val="24"/>
         </w:rPr>
-        <w:t>melaksanakan</w:t>
-      </w:r>
-      <w:proofErr w:type="spellEnd"/>
-      <w:r>
-        <w:rPr>
-          <w:rFonts w:ascii="Bookman Old Style" w:eastAsia="Bookman Old Style" w:hAnsi="Bookman Old Style" w:cs="Bookman Old Style"/>
-          <w:color w:val="000000"/>
-          <w:sz w:val="24"/>
-          <w:szCs w:val="24"/>
-        </w:rPr>
-        <w:t xml:space="preserve"> </w:t>
-      </w:r>
-      <w:proofErr w:type="spellStart"/>
-      <w:r>
-        <w:rPr>
-          <w:rFonts w:ascii="Bookman Old Style" w:eastAsia="Bookman Old Style" w:hAnsi="Bookman Old Style" w:cs="Bookman Old Style"/>
-          <w:color w:val="000000"/>
-          <w:sz w:val="24"/>
-          <w:szCs w:val="24"/>
-        </w:rPr>
-        <w:t>pekerjaan</w:t>
-      </w:r>
-      <w:proofErr w:type="spellEnd"/>
-      <w:r>
-        <w:rPr>
-          <w:rFonts w:ascii="Bookman Old Style" w:eastAsia="Bookman Old Style" w:hAnsi="Bookman Old Style" w:cs="Bookman Old Style"/>
-          <w:color w:val="000000"/>
-          <w:sz w:val="24"/>
-          <w:szCs w:val="24"/>
-        </w:rPr>
-        <w:t xml:space="preserve"> </w:t>
-      </w:r>
-      <w:proofErr w:type="spellStart"/>
-      <w:r>
-        <w:rPr>
-          <w:rFonts w:ascii="Bookman Old Style" w:eastAsia="Bookman Old Style" w:hAnsi="Bookman Old Style" w:cs="Bookman Old Style"/>
-          <w:color w:val="000000"/>
-          <w:sz w:val="24"/>
-          <w:szCs w:val="24"/>
-        </w:rPr>
-        <w:t>Pemeriksaan</w:t>
-      </w:r>
-      <w:proofErr w:type="spellEnd"/>
-      <w:r>
-        <w:rPr>
-          <w:rFonts w:ascii="Bookman Old Style" w:eastAsia="Bookman Old Style" w:hAnsi="Bookman Old Style" w:cs="Bookman Old Style"/>
-          <w:color w:val="000000"/>
-          <w:sz w:val="24"/>
-          <w:szCs w:val="24"/>
-        </w:rPr>
-        <w:t xml:space="preserve"> </w:t>
-      </w:r>
-      <w:proofErr w:type="spellStart"/>
-      <w:r>
-        <w:rPr>
-          <w:rFonts w:ascii="Bookman Old Style" w:eastAsia="Bookman Old Style" w:hAnsi="Bookman Old Style" w:cs="Bookman Old Style"/>
-          <w:color w:val="000000"/>
-          <w:sz w:val="24"/>
-          <w:szCs w:val="24"/>
-        </w:rPr>
-        <w:t>hasil</w:t>
-      </w:r>
-      <w:proofErr w:type="spellEnd"/>
-      <w:r>
-        <w:rPr>
-          <w:rFonts w:ascii="Bookman Old Style" w:eastAsia="Bookman Old Style" w:hAnsi="Bookman Old Style" w:cs="Bookman Old Style"/>
-          <w:color w:val="000000"/>
-          <w:sz w:val="24"/>
-          <w:szCs w:val="24"/>
-        </w:rPr>
-        <w:t xml:space="preserve"> </w:t>
-      </w:r>
-      <w:proofErr w:type="spellStart"/>
-      <w:r>
-        <w:rPr>
-          <w:rFonts w:ascii="Bookman Old Style" w:eastAsia="Bookman Old Style" w:hAnsi="Bookman Old Style" w:cs="Bookman Old Style"/>
-          <w:color w:val="000000"/>
-          <w:sz w:val="24"/>
-          <w:szCs w:val="24"/>
-        </w:rPr>
-        <w:t>Pendataan</w:t>
-      </w:r>
-      <w:proofErr w:type="spellEnd"/>
-      <w:r>
-        <w:rPr>
-          <w:rFonts w:ascii="Bookman Old Style" w:eastAsia="Bookman Old Style" w:hAnsi="Bookman Old Style" w:cs="Bookman Old Style"/>
-          <w:color w:val="000000"/>
-          <w:sz w:val="24"/>
-          <w:szCs w:val="24"/>
-        </w:rPr>
-        <w:t xml:space="preserve"> </w:t>
-      </w:r>
-      <w:proofErr w:type="spellStart"/>
-      <w:r>
-        <w:rPr>
-          <w:rFonts w:ascii="Bookman Old Style" w:eastAsia="Bookman Old Style" w:hAnsi="Bookman Old Style" w:cs="Bookman Old Style"/>
-          <w:color w:val="000000"/>
-          <w:sz w:val="24"/>
-          <w:szCs w:val="24"/>
-        </w:rPr>
-        <w:t>Lapangan</w:t>
-      </w:r>
-      <w:proofErr w:type="spellEnd"/>
-      <w:r>
-        <w:rPr>
-          <w:rFonts w:ascii="Bookman Old Style" w:eastAsia="Bookman Old Style" w:hAnsi="Bookman Old Style" w:cs="Bookman Old Style"/>
-          <w:color w:val="000000"/>
-          <w:sz w:val="24"/>
-          <w:szCs w:val="24"/>
-        </w:rPr>
-        <w:t xml:space="preserve"> Sensus Ekonomi 2026 pada Badan Pusat </w:t>
-      </w:r>
-      <w:proofErr w:type="spellStart"/>
-      <w:r>
-        <w:rPr>
-          <w:rFonts w:ascii="Bookman Old Style" w:eastAsia="Bookman Old Style" w:hAnsi="Bookman Old Style" w:cs="Bookman Old Style"/>
-          <w:color w:val="000000"/>
-          <w:sz w:val="24"/>
-          <w:szCs w:val="24"/>
-        </w:rPr>
-        <w:t>Statistik</w:t>
-      </w:r>
-      <w:proofErr w:type="spellEnd"/>
-      <w:r>
-        <w:rPr>
-          <w:rFonts w:ascii="Bookman Old Style" w:eastAsia="Bookman Old Style" w:hAnsi="Bookman Old Style" w:cs="Bookman Old Style"/>
-          <w:color w:val="000000"/>
-          <w:sz w:val="24"/>
-          <w:szCs w:val="24"/>
-        </w:rPr>
-        <w:t xml:space="preserve"> </w:t>
-      </w:r>
-      <w:proofErr w:type="spellStart"/>
-      <w:r>
-        <w:rPr>
-          <w:rFonts w:ascii="Bookman Old Style" w:eastAsia="Bookman Old Style" w:hAnsi="Bookman Old Style" w:cs="Bookman Old Style"/>
-          <w:color w:val="0000FF"/>
-          <w:sz w:val="24"/>
-          <w:szCs w:val="24"/>
-        </w:rPr>
-        <w:t>Kabupaten</w:t>
-      </w:r>
-      <w:proofErr w:type="spellEnd"/>
-      <w:r>
-        <w:rPr>
-          <w:rFonts w:ascii="Bookman Old Style" w:eastAsia="Bookman Old Style" w:hAnsi="Bookman Old Style" w:cs="Bookman Old Style"/>
-          <w:color w:val="0000FF"/>
-          <w:sz w:val="24"/>
-          <w:szCs w:val="24"/>
-        </w:rPr>
-        <w:t xml:space="preserve"> Barito Kuala</w:t>
-      </w:r>
-      <w:r>
-        <w:rPr>
-          <w:rFonts w:ascii="Bookman Old Style" w:eastAsia="Bookman Old Style" w:hAnsi="Bookman Old Style" w:cs="Bookman Old Style"/>
-          <w:color w:val="000000"/>
-          <w:sz w:val="24"/>
-          <w:szCs w:val="24"/>
-        </w:rPr>
-        <w:t xml:space="preserve"> </w:t>
-      </w:r>
-      <w:proofErr w:type="spellStart"/>
-      <w:r>
-        <w:rPr>
-          <w:rFonts w:ascii="Bookman Old Style" w:eastAsia="Bookman Old Style" w:hAnsi="Bookman Old Style" w:cs="Bookman Old Style"/>
-          <w:color w:val="000000"/>
-          <w:sz w:val="24"/>
-          <w:szCs w:val="24"/>
-        </w:rPr>
-        <w:t>berdasarkan</w:t>
-      </w:r>
-      <w:proofErr w:type="spellEnd"/>
-      <w:r>
-        <w:rPr>
-          <w:rFonts w:ascii="Bookman Old Style" w:eastAsia="Bookman Old Style" w:hAnsi="Bookman Old Style" w:cs="Bookman Old Style"/>
-          <w:color w:val="000000"/>
-          <w:sz w:val="24"/>
-          <w:szCs w:val="24"/>
-        </w:rPr>
-        <w:t xml:space="preserve"> </w:t>
-      </w:r>
-      <w:proofErr w:type="spellStart"/>
-      <w:r>
-        <w:rPr>
-          <w:rFonts w:ascii="Bookman Old Style" w:eastAsia="Bookman Old Style" w:hAnsi="Bookman Old Style" w:cs="Bookman Old Style"/>
-          <w:color w:val="000000"/>
-          <w:sz w:val="24"/>
-          <w:szCs w:val="24"/>
-        </w:rPr>
-        <w:t>Perjanjian</w:t>
-      </w:r>
-      <w:proofErr w:type="spellEnd"/>
-      <w:r>
-        <w:rPr>
-          <w:rFonts w:ascii="Bookman Old Style" w:eastAsia="Bookman Old Style" w:hAnsi="Bookman Old Style" w:cs="Bookman Old Style"/>
-          <w:color w:val="000000"/>
-          <w:sz w:val="24"/>
-          <w:szCs w:val="24"/>
-        </w:rPr>
-        <w:t xml:space="preserve"> </w:t>
-      </w:r>
-      <w:proofErr w:type="spellStart"/>
-      <w:r>
-        <w:rPr>
-          <w:rFonts w:ascii="Bookman Old Style" w:eastAsia="Bookman Old Style" w:hAnsi="Bookman Old Style" w:cs="Bookman Old Style"/>
-          <w:color w:val="000000"/>
-          <w:sz w:val="24"/>
-          <w:szCs w:val="24"/>
-        </w:rPr>
-        <w:t>Kerja</w:t>
-      </w:r>
-      <w:proofErr w:type="spellEnd"/>
-      <w:r>
-        <w:rPr>
-          <w:rFonts w:ascii="Bookman Old Style" w:eastAsia="Bookman Old Style" w:hAnsi="Bookman Old Style" w:cs="Bookman Old Style"/>
-          <w:color w:val="000000"/>
-          <w:sz w:val="24"/>
-          <w:szCs w:val="24"/>
-        </w:rPr>
-        <w:t xml:space="preserve"> Nomor: </w:t>
-      </w:r>
-      <w:r>
-        <w:rPr>
-          <w:rFonts w:ascii="Bookman Old Style" w:eastAsia="Bookman Old Style" w:hAnsi="Bookman Old Style" w:cs="Bookman Old Style"/>
-          <w:color w:val="FF0000"/>
-          <w:sz w:val="24"/>
-          <w:szCs w:val="24"/>
-        </w:rPr>
-        <w:t>{{</w:t>
-      </w:r>
-      <w:proofErr w:type="spellStart"/>
-      <w:r>
-        <w:rPr>
-          <w:rFonts w:ascii="Bookman Old Style" w:eastAsia="Bookman Old Style" w:hAnsi="Bookman Old Style" w:cs="Bookman Old Style"/>
-          <w:color w:val="FF0000"/>
-          <w:sz w:val="24"/>
-          <w:szCs w:val="24"/>
-        </w:rPr>
-        <w:t>no_spk</w:t>
-      </w:r>
-      <w:proofErr w:type="spellEnd"/>
-      <w:r>
-        <w:rPr>
-          <w:rFonts w:ascii="Bookman Old Style" w:eastAsia="Bookman Old Style" w:hAnsi="Bookman Old Style" w:cs="Bookman Old Style"/>
-          <w:color w:val="FF0000"/>
-          <w:sz w:val="24"/>
-          <w:szCs w:val="24"/>
-        </w:rPr>
-        <w:t>}}</w:t>
-      </w:r>
-      <w:r>
-        <w:rPr>
-          <w:rFonts w:ascii="Bookman Old Style" w:eastAsia="Bookman Old Style" w:hAnsi="Bookman Old Style" w:cs="Bookman Old Style"/>
-          <w:color w:val="000000"/>
-          <w:sz w:val="24"/>
-          <w:szCs w:val="24"/>
-        </w:rPr>
-        <w:t xml:space="preserve">, </w:t>
-      </w:r>
-      <w:proofErr w:type="spellStart"/>
-      <w:r>
-        <w:rPr>
-          <w:rFonts w:ascii="Bookman Old Style" w:eastAsia="Bookman Old Style" w:hAnsi="Bookman Old Style" w:cs="Bookman Old Style"/>
-          <w:color w:val="000000"/>
-          <w:sz w:val="24"/>
-          <w:szCs w:val="24"/>
-        </w:rPr>
-        <w:t>sesuai</w:t>
-      </w:r>
-      <w:proofErr w:type="spellEnd"/>
-      <w:r>
-        <w:rPr>
-          <w:rFonts w:ascii="Bookman Old Style" w:eastAsia="Bookman Old Style" w:hAnsi="Bookman Old Style" w:cs="Bookman Old Style"/>
-          <w:color w:val="000000"/>
-          <w:sz w:val="24"/>
-          <w:szCs w:val="24"/>
-        </w:rPr>
-        <w:t xml:space="preserve"> </w:t>
-      </w:r>
-      <w:proofErr w:type="spellStart"/>
-      <w:r>
-        <w:rPr>
-          <w:rFonts w:ascii="Bookman Old Style" w:eastAsia="Bookman Old Style" w:hAnsi="Bookman Old Style" w:cs="Bookman Old Style"/>
-          <w:color w:val="000000"/>
-          <w:sz w:val="24"/>
-          <w:szCs w:val="24"/>
-        </w:rPr>
-        <w:t>dengan</w:t>
-      </w:r>
-      <w:proofErr w:type="spellEnd"/>
-      <w:r>
-        <w:rPr>
-          <w:rFonts w:ascii="Bookman Old Style" w:eastAsia="Bookman Old Style" w:hAnsi="Bookman Old Style" w:cs="Bookman Old Style"/>
-          <w:color w:val="000000"/>
-          <w:sz w:val="24"/>
-          <w:szCs w:val="24"/>
-        </w:rPr>
-        <w:t xml:space="preserve"> target </w:t>
-      </w:r>
-      <w:proofErr w:type="spellStart"/>
-      <w:r>
-        <w:rPr>
-          <w:rFonts w:ascii="Bookman Old Style" w:eastAsia="Bookman Old Style" w:hAnsi="Bookman Old Style" w:cs="Bookman Old Style"/>
-          <w:color w:val="000000"/>
-          <w:sz w:val="24"/>
-          <w:szCs w:val="24"/>
-        </w:rPr>
-        <w:t>pekerjaan</w:t>
-      </w:r>
-      <w:proofErr w:type="spellEnd"/>
-      <w:r>
-        <w:rPr>
-          <w:rFonts w:ascii="Bookman Old Style" w:eastAsia="Bookman Old Style" w:hAnsi="Bookman Old Style" w:cs="Bookman Old Style"/>
-          <w:color w:val="000000"/>
-          <w:sz w:val="24"/>
-          <w:szCs w:val="24"/>
-        </w:rPr>
-        <w:t xml:space="preserve"> </w:t>
+        <w:t xml:space="preserve">, sesuai dengan target pekerjaan </w:t>
       </w:r>
       <w:r>
         <w:rPr>
@@ -955,32 +425,13 @@
           <w:szCs w:val="24"/>
         </w:rPr>
       </w:pPr>
-      <w:proofErr w:type="spellStart"/>
-      <w:r>
-        <w:rPr>
-          <w:rFonts w:ascii="Bookman Old Style" w:eastAsia="Bookman Old Style" w:hAnsi="Bookman Old Style" w:cs="Bookman Old Style"/>
-          <w:sz w:val="24"/>
-          <w:szCs w:val="24"/>
-        </w:rPr>
-        <w:t>bahwa</w:t>
-      </w:r>
-      <w:proofErr w:type="spellEnd"/>
-      <w:r>
-        <w:rPr>
-          <w:rFonts w:ascii="Bookman Old Style" w:eastAsia="Bookman Old Style" w:hAnsi="Bookman Old Style" w:cs="Bookman Old Style"/>
-          <w:sz w:val="24"/>
-          <w:szCs w:val="24"/>
-        </w:rPr>
-        <w:t xml:space="preserve"> </w:t>
-      </w:r>
-      <w:proofErr w:type="spellStart"/>
-      <w:r>
-        <w:rPr>
-          <w:rFonts w:ascii="Bookman Old Style" w:eastAsia="Bookman Old Style" w:hAnsi="Bookman Old Style" w:cs="Bookman Old Style"/>
-          <w:sz w:val="24"/>
-          <w:szCs w:val="24"/>
-        </w:rPr>
-        <w:t>h</w:t>
+      <w:r>
+        <w:rPr>
+          <w:rFonts w:ascii="Bookman Old Style" w:eastAsia="Bookman Old Style" w:hAnsi="Bookman Old Style" w:cs="Bookman Old Style"/>
+          <w:sz w:val="24"/>
+          <w:szCs w:val="24"/>
+        </w:rPr>
+        <w:t>bahwa h</w:t>
       </w:r>
       <w:r>
         <w:rPr>
@@ -989,9 +440,16 @@
           <w:sz w:val="24"/>
           <w:szCs w:val="24"/>
         </w:rPr>
-        <w:t>asil</w:t>
-      </w:r>
-      <w:proofErr w:type="spellEnd"/>
+        <w:t xml:space="preserve">asil pekerjaan </w:t>
+      </w:r>
+      <w:r>
+        <w:rPr>
+          <w:rFonts w:ascii="Bookman Old Style" w:eastAsia="Bookman Old Style" w:hAnsi="Bookman Old Style" w:cs="Bookman Old Style"/>
+          <w:sz w:val="24"/>
+          <w:szCs w:val="24"/>
+        </w:rPr>
+        <w:t xml:space="preserve">Pemeriksaan </w:t>
+      </w:r>
       <w:r>
         <w:rPr>
           <w:rFonts w:ascii="Bookman Old Style" w:eastAsia="Bookman Old Style" w:hAnsi="Bookman Old Style" w:cs="Bookman Old Style"/>
@@ -999,9 +457,8 @@
           <w:sz w:val="24"/>
           <w:szCs w:val="24"/>
         </w:rPr>
-        <w:t xml:space="preserve"> </w:t>
-      </w:r>
-      <w:proofErr w:type="spellStart"/>
+        <w:t xml:space="preserve">Lapangan Sensus Ekonomi 2026 </w:t>
+      </w:r>
       <w:r>
         <w:rPr>
           <w:rFonts w:ascii="Bookman Old Style" w:eastAsia="Bookman Old Style" w:hAnsi="Bookman Old Style" w:cs="Bookman Old Style"/>
@@ -1009,9 +466,8 @@
           <w:sz w:val="24"/>
           <w:szCs w:val="24"/>
         </w:rPr>
-        <w:t>pekerjaan</w:t>
-      </w:r>
-      <w:proofErr w:type="spellEnd"/>
+        <w:t>Termin II</w:t>
+      </w:r>
       <w:r>
         <w:rPr>
           <w:rFonts w:ascii="Bookman Old Style" w:eastAsia="Bookman Old Style" w:hAnsi="Bookman Old Style" w:cs="Bookman Old Style"/>
@@ -1019,147 +475,15 @@
           <w:sz w:val="24"/>
           <w:szCs w:val="24"/>
         </w:rPr>
-        <w:t xml:space="preserve"> </w:t>
-      </w:r>
-      <w:proofErr w:type="spellStart"/>
-      <w:r>
-        <w:rPr>
-          <w:rFonts w:ascii="Bookman Old Style" w:eastAsia="Bookman Old Style" w:hAnsi="Bookman Old Style" w:cs="Bookman Old Style"/>
-          <w:sz w:val="24"/>
-          <w:szCs w:val="24"/>
-        </w:rPr>
-        <w:t>Pemeriksaan</w:t>
-      </w:r>
-      <w:proofErr w:type="spellEnd"/>
-      <w:r>
-        <w:rPr>
-          <w:rFonts w:ascii="Bookman Old Style" w:eastAsia="Bookman Old Style" w:hAnsi="Bookman Old Style" w:cs="Bookman Old Style"/>
-          <w:sz w:val="24"/>
-          <w:szCs w:val="24"/>
-        </w:rPr>
-        <w:t xml:space="preserve"> </w:t>
-      </w:r>
-      <w:proofErr w:type="spellStart"/>
-      <w:r>
-        <w:rPr>
-          <w:rFonts w:ascii="Bookman Old Style" w:eastAsia="Bookman Old Style" w:hAnsi="Bookman Old Style" w:cs="Bookman Old Style"/>
-          <w:color w:val="000000"/>
-          <w:sz w:val="24"/>
-          <w:szCs w:val="24"/>
-        </w:rPr>
-        <w:t>Lapangan</w:t>
-      </w:r>
-      <w:proofErr w:type="spellEnd"/>
-      <w:r>
-        <w:rPr>
-          <w:rFonts w:ascii="Bookman Old Style" w:eastAsia="Bookman Old Style" w:hAnsi="Bookman Old Style" w:cs="Bookman Old Style"/>
-          <w:color w:val="000000"/>
-          <w:sz w:val="24"/>
-          <w:szCs w:val="24"/>
-        </w:rPr>
-        <w:t xml:space="preserve"> Sensus Ekonomi 2026 </w:t>
-      </w:r>
-      <w:r>
-        <w:rPr>
-          <w:rFonts w:ascii="Bookman Old Style" w:eastAsia="Bookman Old Style" w:hAnsi="Bookman Old Style" w:cs="Bookman Old Style"/>
-          <w:color w:val="000000"/>
-          <w:sz w:val="24"/>
-          <w:szCs w:val="24"/>
-        </w:rPr>
-        <w:t>Termin II</w:t>
-      </w:r>
-      <w:r>
-        <w:rPr>
-          <w:rFonts w:ascii="Bookman Old Style" w:eastAsia="Bookman Old Style" w:hAnsi="Bookman Old Style" w:cs="Bookman Old Style"/>
-          <w:color w:val="000000"/>
-          <w:sz w:val="24"/>
-          <w:szCs w:val="24"/>
-        </w:rPr>
-        <w:t xml:space="preserve"> </w:t>
-      </w:r>
-      <w:proofErr w:type="spellStart"/>
-      <w:r>
-        <w:rPr>
-          <w:rFonts w:ascii="Bookman Old Style" w:eastAsia="Bookman Old Style" w:hAnsi="Bookman Old Style" w:cs="Bookman Old Style"/>
-          <w:color w:val="000000"/>
-          <w:sz w:val="24"/>
-          <w:szCs w:val="24"/>
-        </w:rPr>
-        <w:t>telah</w:t>
-      </w:r>
-      <w:proofErr w:type="spellEnd"/>
-      <w:r>
-        <w:rPr>
-          <w:rFonts w:ascii="Bookman Old Style" w:eastAsia="Bookman Old Style" w:hAnsi="Bookman Old Style" w:cs="Bookman Old Style"/>
-          <w:color w:val="000000"/>
-          <w:sz w:val="24"/>
-          <w:szCs w:val="24"/>
-        </w:rPr>
-        <w:t xml:space="preserve"> </w:t>
-      </w:r>
-      <w:proofErr w:type="spellStart"/>
-      <w:r>
-        <w:rPr>
-          <w:rFonts w:ascii="Bookman Old Style" w:eastAsia="Bookman Old Style" w:hAnsi="Bookman Old Style" w:cs="Bookman Old Style"/>
-          <w:color w:val="000000"/>
-          <w:sz w:val="24"/>
-          <w:szCs w:val="24"/>
-        </w:rPr>
-        <w:t>diperiksa</w:t>
-      </w:r>
-      <w:proofErr w:type="spellEnd"/>
-      <w:r>
-        <w:rPr>
-          <w:rFonts w:ascii="Bookman Old Style" w:eastAsia="Bookman Old Style" w:hAnsi="Bookman Old Style" w:cs="Bookman Old Style"/>
-          <w:color w:val="000000"/>
-          <w:sz w:val="24"/>
-          <w:szCs w:val="24"/>
-        </w:rPr>
-        <w:t xml:space="preserve"> </w:t>
-      </w:r>
-      <w:r>
-        <w:rPr>
-          <w:rFonts w:ascii="Bookman Old Style" w:eastAsia="Bookman Old Style" w:hAnsi="Bookman Old Style" w:cs="Bookman Old Style"/>
-          <w:sz w:val="24"/>
-          <w:szCs w:val="24"/>
-        </w:rPr>
-        <w:t xml:space="preserve">dan </w:t>
-      </w:r>
-      <w:proofErr w:type="spellStart"/>
-      <w:r>
-        <w:rPr>
-          <w:rFonts w:ascii="Bookman Old Style" w:eastAsia="Bookman Old Style" w:hAnsi="Bookman Old Style" w:cs="Bookman Old Style"/>
-          <w:sz w:val="24"/>
-          <w:szCs w:val="24"/>
-        </w:rPr>
-        <w:t>diketahui</w:t>
-      </w:r>
-      <w:proofErr w:type="spellEnd"/>
-      <w:r>
-        <w:rPr>
-          <w:rFonts w:ascii="Bookman Old Style" w:eastAsia="Bookman Old Style" w:hAnsi="Bookman Old Style" w:cs="Bookman Old Style"/>
-          <w:sz w:val="24"/>
-          <w:szCs w:val="24"/>
-        </w:rPr>
-        <w:t xml:space="preserve"> oleh </w:t>
-      </w:r>
-      <w:proofErr w:type="spellStart"/>
-      <w:r>
-        <w:rPr>
-          <w:rFonts w:ascii="Bookman Old Style" w:eastAsia="Bookman Old Style" w:hAnsi="Bookman Old Style" w:cs="Bookman Old Style"/>
-          <w:sz w:val="24"/>
-          <w:szCs w:val="24"/>
-        </w:rPr>
-        <w:t>Ketua</w:t>
-      </w:r>
-      <w:proofErr w:type="spellEnd"/>
-      <w:r>
-        <w:rPr>
-          <w:rFonts w:ascii="Bookman Old Style" w:eastAsia="Bookman Old Style" w:hAnsi="Bookman Old Style" w:cs="Bookman Old Style"/>
-          <w:sz w:val="24"/>
-          <w:szCs w:val="24"/>
-        </w:rPr>
-        <w:t xml:space="preserve"> Tim Pelaksana Sensus Ekonomi 2026 </w:t>
+        <w:t xml:space="preserve"> telah diperiksa </w:t>
+      </w:r>
+      <w:r>
+        <w:rPr>
+          <w:rFonts w:ascii="Bookman Old Style" w:eastAsia="Bookman Old Style" w:hAnsi="Bookman Old Style" w:cs="Bookman Old Style"/>
+          <w:sz w:val="24"/>
+          <w:szCs w:val="24"/>
+        </w:rPr>
+        <w:t xml:space="preserve">dan diketahui oleh Ketua Tim Pelaksana Sensus Ekonomi 2026 </w:t>
       </w:r>
       <w:r>
         <w:rPr>
@@ -1168,27 +492,7 @@
           <w:sz w:val="24"/>
           <w:szCs w:val="24"/>
         </w:rPr>
-        <w:t xml:space="preserve">BPS </w:t>
-      </w:r>
-      <w:proofErr w:type="spellStart"/>
-      <w:r>
-        <w:rPr>
-          <w:rFonts w:ascii="Bookman Old Style" w:eastAsia="Bookman Old Style" w:hAnsi="Bookman Old Style" w:cs="Bookman Old Style"/>
-          <w:color w:val="0000FF"/>
-          <w:sz w:val="24"/>
-          <w:szCs w:val="24"/>
-        </w:rPr>
-        <w:t>Kabupaten</w:t>
-      </w:r>
-      <w:proofErr w:type="spellEnd"/>
-      <w:r>
-        <w:rPr>
-          <w:rFonts w:ascii="Bookman Old Style" w:eastAsia="Bookman Old Style" w:hAnsi="Bookman Old Style" w:cs="Bookman Old Style"/>
-          <w:color w:val="0000FF"/>
-          <w:sz w:val="24"/>
-          <w:szCs w:val="24"/>
-        </w:rPr>
-        <w:t xml:space="preserve"> Barito Kuala</w:t>
+        <w:t>BPS Kabupaten Barito Kuala</w:t>
       </w:r>
       <w:r>
         <w:rPr>
@@ -1215,32 +519,13 @@
           <w:szCs w:val="24"/>
         </w:rPr>
       </w:pPr>
-      <w:proofErr w:type="spellStart"/>
-      <w:r>
-        <w:rPr>
-          <w:rFonts w:ascii="Bookman Old Style" w:eastAsia="Bookman Old Style" w:hAnsi="Bookman Old Style" w:cs="Bookman Old Style"/>
-          <w:sz w:val="24"/>
-          <w:szCs w:val="24"/>
-        </w:rPr>
-        <w:t>bahwa</w:t>
-      </w:r>
-      <w:proofErr w:type="spellEnd"/>
-      <w:r>
-        <w:rPr>
-          <w:rFonts w:ascii="Bookman Old Style" w:eastAsia="Bookman Old Style" w:hAnsi="Bookman Old Style" w:cs="Bookman Old Style"/>
-          <w:sz w:val="24"/>
-          <w:szCs w:val="24"/>
-        </w:rPr>
-        <w:t xml:space="preserve"> </w:t>
-      </w:r>
-      <w:proofErr w:type="spellStart"/>
-      <w:r>
-        <w:rPr>
-          <w:rFonts w:ascii="Bookman Old Style" w:eastAsia="Bookman Old Style" w:hAnsi="Bookman Old Style" w:cs="Bookman Old Style"/>
-          <w:sz w:val="24"/>
-          <w:szCs w:val="24"/>
-        </w:rPr>
-        <w:t>h</w:t>
+      <w:r>
+        <w:rPr>
+          <w:rFonts w:ascii="Bookman Old Style" w:eastAsia="Bookman Old Style" w:hAnsi="Bookman Old Style" w:cs="Bookman Old Style"/>
+          <w:sz w:val="24"/>
+          <w:szCs w:val="24"/>
+        </w:rPr>
+        <w:t>bahwa h</w:t>
       </w:r>
       <w:r>
         <w:rPr>
@@ -1249,9 +534,16 @@
           <w:sz w:val="24"/>
           <w:szCs w:val="24"/>
         </w:rPr>
-        <w:t>asil</w:t>
-      </w:r>
-      <w:proofErr w:type="spellEnd"/>
+        <w:t xml:space="preserve">asil pekerjaan yang telah diselesaikan dan diperiksa sebagaimana dimaksud dalam angka 1 dan angka 2 </w:t>
+      </w:r>
+      <w:r>
+        <w:rPr>
+          <w:rFonts w:ascii="Bookman Old Style" w:eastAsia="Bookman Old Style" w:hAnsi="Bookman Old Style" w:cs="Bookman Old Style"/>
+          <w:sz w:val="24"/>
+          <w:szCs w:val="24"/>
+        </w:rPr>
+        <w:t xml:space="preserve">tercantum </w:t>
+      </w:r>
       <w:r>
         <w:rPr>
           <w:rFonts w:ascii="Bookman Old Style" w:eastAsia="Bookman Old Style" w:hAnsi="Bookman Old Style" w:cs="Bookman Old Style"/>
@@ -1259,237 +551,8 @@
           <w:sz w:val="24"/>
           <w:szCs w:val="24"/>
         </w:rPr>
-        <w:t xml:space="preserve"> </w:t>
-      </w:r>
-      <w:proofErr w:type="spellStart"/>
-      <w:r>
-        <w:rPr>
-          <w:rFonts w:ascii="Bookman Old Style" w:eastAsia="Bookman Old Style" w:hAnsi="Bookman Old Style" w:cs="Bookman Old Style"/>
-          <w:color w:val="000000"/>
-          <w:sz w:val="24"/>
-          <w:szCs w:val="24"/>
-        </w:rPr>
-        <w:t>pekerjaan</w:t>
-      </w:r>
-      <w:proofErr w:type="spellEnd"/>
-      <w:r>
-        <w:rPr>
-          <w:rFonts w:ascii="Bookman Old Style" w:eastAsia="Bookman Old Style" w:hAnsi="Bookman Old Style" w:cs="Bookman Old Style"/>
-          <w:color w:val="000000"/>
-          <w:sz w:val="24"/>
-          <w:szCs w:val="24"/>
-        </w:rPr>
-        <w:t xml:space="preserve"> yang </w:t>
-      </w:r>
-      <w:proofErr w:type="spellStart"/>
-      <w:r>
-        <w:rPr>
-          <w:rFonts w:ascii="Bookman Old Style" w:eastAsia="Bookman Old Style" w:hAnsi="Bookman Old Style" w:cs="Bookman Old Style"/>
-          <w:color w:val="000000"/>
-          <w:sz w:val="24"/>
-          <w:szCs w:val="24"/>
-        </w:rPr>
-        <w:t>telah</w:t>
-      </w:r>
-      <w:proofErr w:type="spellEnd"/>
-      <w:r>
-        <w:rPr>
-          <w:rFonts w:ascii="Bookman Old Style" w:eastAsia="Bookman Old Style" w:hAnsi="Bookman Old Style" w:cs="Bookman Old Style"/>
-          <w:color w:val="000000"/>
-          <w:sz w:val="24"/>
-          <w:szCs w:val="24"/>
-        </w:rPr>
-        <w:t xml:space="preserve"> </w:t>
-      </w:r>
-      <w:proofErr w:type="spellStart"/>
-      <w:r>
-        <w:rPr>
-          <w:rFonts w:ascii="Bookman Old Style" w:eastAsia="Bookman Old Style" w:hAnsi="Bookman Old Style" w:cs="Bookman Old Style"/>
-          <w:color w:val="000000"/>
-          <w:sz w:val="24"/>
-          <w:szCs w:val="24"/>
-        </w:rPr>
-        <w:t>diselesaikan</w:t>
-      </w:r>
-      <w:proofErr w:type="spellEnd"/>
-      <w:r>
-        <w:rPr>
-          <w:rFonts w:ascii="Bookman Old Style" w:eastAsia="Bookman Old Style" w:hAnsi="Bookman Old Style" w:cs="Bookman Old Style"/>
-          <w:color w:val="000000"/>
-          <w:sz w:val="24"/>
-          <w:szCs w:val="24"/>
-        </w:rPr>
-        <w:t xml:space="preserve"> dan </w:t>
-      </w:r>
-      <w:proofErr w:type="spellStart"/>
-      <w:r>
-        <w:rPr>
-          <w:rFonts w:ascii="Bookman Old Style" w:eastAsia="Bookman Old Style" w:hAnsi="Bookman Old Style" w:cs="Bookman Old Style"/>
-          <w:color w:val="000000"/>
-          <w:sz w:val="24"/>
-          <w:szCs w:val="24"/>
-        </w:rPr>
-        <w:t>diperiksa</w:t>
-      </w:r>
-      <w:proofErr w:type="spellEnd"/>
-      <w:r>
-        <w:rPr>
-          <w:rFonts w:ascii="Bookman Old Style" w:eastAsia="Bookman Old Style" w:hAnsi="Bookman Old Style" w:cs="Bookman Old Style"/>
-          <w:color w:val="000000"/>
-          <w:sz w:val="24"/>
-          <w:szCs w:val="24"/>
-        </w:rPr>
-        <w:t xml:space="preserve"> </w:t>
-      </w:r>
-      <w:proofErr w:type="spellStart"/>
-      <w:r>
-        <w:rPr>
-          <w:rFonts w:ascii="Bookman Old Style" w:eastAsia="Bookman Old Style" w:hAnsi="Bookman Old Style" w:cs="Bookman Old Style"/>
-          <w:color w:val="000000"/>
-          <w:sz w:val="24"/>
-          <w:szCs w:val="24"/>
-        </w:rPr>
-        <w:t>sebagaimana</w:t>
-      </w:r>
-      <w:proofErr w:type="spellEnd"/>
-      <w:r>
-        <w:rPr>
-          <w:rFonts w:ascii="Bookman Old Style" w:eastAsia="Bookman Old Style" w:hAnsi="Bookman Old Style" w:cs="Bookman Old Style"/>
-          <w:color w:val="000000"/>
-          <w:sz w:val="24"/>
-          <w:szCs w:val="24"/>
-        </w:rPr>
-        <w:t xml:space="preserve"> </w:t>
-      </w:r>
-      <w:proofErr w:type="spellStart"/>
-      <w:r>
-        <w:rPr>
-          <w:rFonts w:ascii="Bookman Old Style" w:eastAsia="Bookman Old Style" w:hAnsi="Bookman Old Style" w:cs="Bookman Old Style"/>
-          <w:color w:val="000000"/>
-          <w:sz w:val="24"/>
-          <w:szCs w:val="24"/>
-        </w:rPr>
-        <w:t>dimaksud</w:t>
-      </w:r>
-      <w:proofErr w:type="spellEnd"/>
-      <w:r>
-        <w:rPr>
-          <w:rFonts w:ascii="Bookman Old Style" w:eastAsia="Bookman Old Style" w:hAnsi="Bookman Old Style" w:cs="Bookman Old Style"/>
-          <w:color w:val="000000"/>
-          <w:sz w:val="24"/>
-          <w:szCs w:val="24"/>
-        </w:rPr>
-        <w:t xml:space="preserve"> </w:t>
-      </w:r>
-      <w:proofErr w:type="spellStart"/>
-      <w:r>
-        <w:rPr>
-          <w:rFonts w:ascii="Bookman Old Style" w:eastAsia="Bookman Old Style" w:hAnsi="Bookman Old Style" w:cs="Bookman Old Style"/>
-          <w:color w:val="000000"/>
-          <w:sz w:val="24"/>
-          <w:szCs w:val="24"/>
-        </w:rPr>
-        <w:t>dalam</w:t>
-      </w:r>
-      <w:proofErr w:type="spellEnd"/>
-      <w:r>
-        <w:rPr>
-          <w:rFonts w:ascii="Bookman Old Style" w:eastAsia="Bookman Old Style" w:hAnsi="Bookman Old Style" w:cs="Bookman Old Style"/>
-          <w:color w:val="000000"/>
-          <w:sz w:val="24"/>
-          <w:szCs w:val="24"/>
-        </w:rPr>
-        <w:t xml:space="preserve"> </w:t>
-      </w:r>
-      <w:proofErr w:type="spellStart"/>
-      <w:r>
-        <w:rPr>
-          <w:rFonts w:ascii="Bookman Old Style" w:eastAsia="Bookman Old Style" w:hAnsi="Bookman Old Style" w:cs="Bookman Old Style"/>
-          <w:color w:val="000000"/>
-          <w:sz w:val="24"/>
-          <w:szCs w:val="24"/>
-        </w:rPr>
-        <w:t>angka</w:t>
-      </w:r>
-      <w:proofErr w:type="spellEnd"/>
-      <w:r>
-        <w:rPr>
-          <w:rFonts w:ascii="Bookman Old Style" w:eastAsia="Bookman Old Style" w:hAnsi="Bookman Old Style" w:cs="Bookman Old Style"/>
-          <w:color w:val="000000"/>
-          <w:sz w:val="24"/>
-          <w:szCs w:val="24"/>
-        </w:rPr>
-        <w:t xml:space="preserve"> 1 dan </w:t>
-      </w:r>
-      <w:proofErr w:type="spellStart"/>
-      <w:r>
-        <w:rPr>
-          <w:rFonts w:ascii="Bookman Old Style" w:eastAsia="Bookman Old Style" w:hAnsi="Bookman Old Style" w:cs="Bookman Old Style"/>
-          <w:color w:val="000000"/>
-          <w:sz w:val="24"/>
-          <w:szCs w:val="24"/>
-        </w:rPr>
-        <w:t>angka</w:t>
-      </w:r>
-      <w:proofErr w:type="spellEnd"/>
-      <w:r>
-        <w:rPr>
-          <w:rFonts w:ascii="Bookman Old Style" w:eastAsia="Bookman Old Style" w:hAnsi="Bookman Old Style" w:cs="Bookman Old Style"/>
-          <w:color w:val="000000"/>
-          <w:sz w:val="24"/>
-          <w:szCs w:val="24"/>
-        </w:rPr>
-        <w:t xml:space="preserve"> 2 </w:t>
-      </w:r>
-      <w:proofErr w:type="spellStart"/>
-      <w:r>
-        <w:rPr>
-          <w:rFonts w:ascii="Bookman Old Style" w:eastAsia="Bookman Old Style" w:hAnsi="Bookman Old Style" w:cs="Bookman Old Style"/>
-          <w:sz w:val="24"/>
-          <w:szCs w:val="24"/>
-        </w:rPr>
-        <w:t>tercantum</w:t>
-      </w:r>
-      <w:proofErr w:type="spellEnd"/>
-      <w:r>
-        <w:rPr>
-          <w:rFonts w:ascii="Bookman Old Style" w:eastAsia="Bookman Old Style" w:hAnsi="Bookman Old Style" w:cs="Bookman Old Style"/>
-          <w:sz w:val="24"/>
-          <w:szCs w:val="24"/>
-        </w:rPr>
-        <w:t xml:space="preserve"> </w:t>
-      </w:r>
-      <w:proofErr w:type="spellStart"/>
-      <w:r>
-        <w:rPr>
-          <w:rFonts w:ascii="Bookman Old Style" w:eastAsia="Bookman Old Style" w:hAnsi="Bookman Old Style" w:cs="Bookman Old Style"/>
-          <w:color w:val="000000"/>
-          <w:sz w:val="24"/>
-          <w:szCs w:val="24"/>
-        </w:rPr>
-        <w:t>dalam</w:t>
-      </w:r>
-      <w:proofErr w:type="spellEnd"/>
-      <w:r>
-        <w:rPr>
-          <w:rFonts w:ascii="Bookman Old Style" w:eastAsia="Bookman Old Style" w:hAnsi="Bookman Old Style" w:cs="Bookman Old Style"/>
-          <w:color w:val="000000"/>
-          <w:sz w:val="24"/>
-          <w:szCs w:val="24"/>
-        </w:rPr>
-        <w:t xml:space="preserve"> </w:t>
-      </w:r>
-      <w:proofErr w:type="spellStart"/>
-      <w:r>
-        <w:rPr>
-          <w:rFonts w:ascii="Bookman Old Style" w:eastAsia="Bookman Old Style" w:hAnsi="Bookman Old Style" w:cs="Bookman Old Style"/>
-          <w:color w:val="000000"/>
-          <w:sz w:val="24"/>
-          <w:szCs w:val="24"/>
-        </w:rPr>
-        <w:t>lampiran</w:t>
-      </w:r>
-      <w:proofErr w:type="spellEnd"/>
+        <w:t>dalam lampiran</w:t>
+      </w:r>
       <w:r>
         <w:rPr>
           <w:rFonts w:ascii="Bookman Old Style" w:eastAsia="Bookman Old Style" w:hAnsi="Bookman Old Style" w:cs="Bookman Old Style"/>
@@ -1515,7 +578,6 @@
           <w:szCs w:val="24"/>
         </w:rPr>
       </w:pPr>
-      <w:proofErr w:type="spellStart"/>
       <w:r>
         <w:rPr>
           <w:rFonts w:ascii="Bookman Old Style" w:eastAsia="Bookman Old Style" w:hAnsi="Bookman Old Style" w:cs="Bookman Old Style"/>
@@ -1523,9 +585,32 @@
           <w:sz w:val="24"/>
           <w:szCs w:val="24"/>
         </w:rPr>
-        <w:t>bahwa</w:t>
-      </w:r>
-      <w:proofErr w:type="spellEnd"/>
+        <w:t xml:space="preserve">bahwa seluruh </w:t>
+      </w:r>
+      <w:r>
+        <w:rPr>
+          <w:rFonts w:ascii="Bookman Old Style" w:eastAsia="Bookman Old Style" w:hAnsi="Bookman Old Style" w:cs="Bookman Old Style"/>
+          <w:sz w:val="24"/>
+          <w:szCs w:val="24"/>
+        </w:rPr>
+        <w:t xml:space="preserve">hasil pekerjaan </w:t>
+      </w:r>
+      <w:r>
+        <w:rPr>
+          <w:rFonts w:ascii="Bookman Old Style" w:eastAsia="Bookman Old Style" w:hAnsi="Bookman Old Style" w:cs="Bookman Old Style"/>
+          <w:sz w:val="24"/>
+          <w:szCs w:val="24"/>
+        </w:rPr>
+        <w:t>Termin II</w:t>
+      </w:r>
+      <w:r>
+        <w:rPr>
+          <w:rFonts w:ascii="Bookman Old Style" w:eastAsia="Bookman Old Style" w:hAnsi="Bookman Old Style" w:cs="Bookman Old Style"/>
+          <w:sz w:val="24"/>
+          <w:szCs w:val="24"/>
+        </w:rPr>
+        <w:t xml:space="preserve"> </w:t>
+      </w:r>
       <w:r>
         <w:rPr>
           <w:rFonts w:ascii="Bookman Old Style" w:eastAsia="Bookman Old Style" w:hAnsi="Bookman Old Style" w:cs="Bookman Old Style"/>
@@ -1533,251 +618,8 @@
           <w:sz w:val="24"/>
           <w:szCs w:val="24"/>
         </w:rPr>
-        <w:t xml:space="preserve"> </w:t>
-      </w:r>
-      <w:proofErr w:type="spellStart"/>
-      <w:r>
-        <w:rPr>
-          <w:rFonts w:ascii="Bookman Old Style" w:eastAsia="Bookman Old Style" w:hAnsi="Bookman Old Style" w:cs="Bookman Old Style"/>
-          <w:color w:val="000000"/>
-          <w:sz w:val="24"/>
-          <w:szCs w:val="24"/>
-        </w:rPr>
-        <w:t>seluruh</w:t>
-      </w:r>
-      <w:proofErr w:type="spellEnd"/>
-      <w:r>
-        <w:rPr>
-          <w:rFonts w:ascii="Bookman Old Style" w:eastAsia="Bookman Old Style" w:hAnsi="Bookman Old Style" w:cs="Bookman Old Style"/>
-          <w:color w:val="000000"/>
-          <w:sz w:val="24"/>
-          <w:szCs w:val="24"/>
-        </w:rPr>
-        <w:t xml:space="preserve"> </w:t>
-      </w:r>
-      <w:proofErr w:type="spellStart"/>
-      <w:r>
-        <w:rPr>
-          <w:rFonts w:ascii="Bookman Old Style" w:eastAsia="Bookman Old Style" w:hAnsi="Bookman Old Style" w:cs="Bookman Old Style"/>
-          <w:sz w:val="24"/>
-          <w:szCs w:val="24"/>
-        </w:rPr>
-        <w:t>hasil</w:t>
-      </w:r>
-      <w:proofErr w:type="spellEnd"/>
-      <w:r>
-        <w:rPr>
-          <w:rFonts w:ascii="Bookman Old Style" w:eastAsia="Bookman Old Style" w:hAnsi="Bookman Old Style" w:cs="Bookman Old Style"/>
-          <w:sz w:val="24"/>
-          <w:szCs w:val="24"/>
-        </w:rPr>
-        <w:t xml:space="preserve"> </w:t>
-      </w:r>
-      <w:proofErr w:type="spellStart"/>
-      <w:r>
-        <w:rPr>
-          <w:rFonts w:ascii="Bookman Old Style" w:eastAsia="Bookman Old Style" w:hAnsi="Bookman Old Style" w:cs="Bookman Old Style"/>
-          <w:sz w:val="24"/>
-          <w:szCs w:val="24"/>
-        </w:rPr>
-        <w:t>pekerjaan</w:t>
-      </w:r>
-      <w:proofErr w:type="spellEnd"/>
-      <w:r>
-        <w:rPr>
-          <w:rFonts w:ascii="Bookman Old Style" w:eastAsia="Bookman Old Style" w:hAnsi="Bookman Old Style" w:cs="Bookman Old Style"/>
-          <w:sz w:val="24"/>
-          <w:szCs w:val="24"/>
-        </w:rPr>
-        <w:t xml:space="preserve"> </w:t>
-      </w:r>
-      <w:r>
-        <w:rPr>
-          <w:rFonts w:ascii="Bookman Old Style" w:eastAsia="Bookman Old Style" w:hAnsi="Bookman Old Style" w:cs="Bookman Old Style"/>
-          <w:sz w:val="24"/>
-          <w:szCs w:val="24"/>
-        </w:rPr>
-        <w:t>Termin II</w:t>
-      </w:r>
-      <w:r>
-        <w:rPr>
-          <w:rFonts w:ascii="Bookman Old Style" w:eastAsia="Bookman Old Style" w:hAnsi="Bookman Old Style" w:cs="Bookman Old Style"/>
-          <w:sz w:val="24"/>
-          <w:szCs w:val="24"/>
-        </w:rPr>
-        <w:t xml:space="preserve"> </w:t>
-      </w:r>
-      <w:proofErr w:type="spellStart"/>
-      <w:r>
-        <w:rPr>
-          <w:rFonts w:ascii="Bookman Old Style" w:eastAsia="Bookman Old Style" w:hAnsi="Bookman Old Style" w:cs="Bookman Old Style"/>
-          <w:color w:val="000000"/>
-          <w:sz w:val="24"/>
-          <w:szCs w:val="24"/>
-        </w:rPr>
-        <w:t>adalah</w:t>
-      </w:r>
-      <w:proofErr w:type="spellEnd"/>
-      <w:r>
-        <w:rPr>
-          <w:rFonts w:ascii="Bookman Old Style" w:eastAsia="Bookman Old Style" w:hAnsi="Bookman Old Style" w:cs="Bookman Old Style"/>
-          <w:color w:val="000000"/>
-          <w:sz w:val="24"/>
-          <w:szCs w:val="24"/>
-        </w:rPr>
-        <w:t xml:space="preserve"> </w:t>
-      </w:r>
-      <w:proofErr w:type="spellStart"/>
-      <w:r>
-        <w:rPr>
-          <w:rFonts w:ascii="Bookman Old Style" w:eastAsia="Bookman Old Style" w:hAnsi="Bookman Old Style" w:cs="Bookman Old Style"/>
-          <w:color w:val="000000"/>
-          <w:sz w:val="24"/>
-          <w:szCs w:val="24"/>
-        </w:rPr>
-        <w:t>benar</w:t>
-      </w:r>
-      <w:proofErr w:type="spellEnd"/>
-      <w:r>
-        <w:rPr>
-          <w:rFonts w:ascii="Bookman Old Style" w:eastAsia="Bookman Old Style" w:hAnsi="Bookman Old Style" w:cs="Bookman Old Style"/>
-          <w:color w:val="000000"/>
-          <w:sz w:val="24"/>
-          <w:szCs w:val="24"/>
-        </w:rPr>
-        <w:t xml:space="preserve">, </w:t>
-      </w:r>
-      <w:proofErr w:type="spellStart"/>
-      <w:r>
-        <w:rPr>
-          <w:rFonts w:ascii="Bookman Old Style" w:eastAsia="Bookman Old Style" w:hAnsi="Bookman Old Style" w:cs="Bookman Old Style"/>
-          <w:color w:val="000000"/>
-          <w:sz w:val="24"/>
-          <w:szCs w:val="24"/>
-        </w:rPr>
-        <w:t>akurat</w:t>
-      </w:r>
-      <w:proofErr w:type="spellEnd"/>
-      <w:r>
-        <w:rPr>
-          <w:rFonts w:ascii="Bookman Old Style" w:eastAsia="Bookman Old Style" w:hAnsi="Bookman Old Style" w:cs="Bookman Old Style"/>
-          <w:color w:val="000000"/>
-          <w:sz w:val="24"/>
-          <w:szCs w:val="24"/>
-        </w:rPr>
-        <w:t xml:space="preserve">, dan </w:t>
-      </w:r>
-      <w:proofErr w:type="spellStart"/>
-      <w:r>
-        <w:rPr>
-          <w:rFonts w:ascii="Bookman Old Style" w:eastAsia="Bookman Old Style" w:hAnsi="Bookman Old Style" w:cs="Bookman Old Style"/>
-          <w:color w:val="000000"/>
-          <w:sz w:val="24"/>
-          <w:szCs w:val="24"/>
-        </w:rPr>
-        <w:t>dapat</w:t>
-      </w:r>
-      <w:proofErr w:type="spellEnd"/>
-      <w:r>
-        <w:rPr>
-          <w:rFonts w:ascii="Bookman Old Style" w:eastAsia="Bookman Old Style" w:hAnsi="Bookman Old Style" w:cs="Bookman Old Style"/>
-          <w:color w:val="000000"/>
-          <w:sz w:val="24"/>
-          <w:szCs w:val="24"/>
-        </w:rPr>
-        <w:t xml:space="preserve"> </w:t>
-      </w:r>
-      <w:proofErr w:type="spellStart"/>
-      <w:r>
-        <w:rPr>
-          <w:rFonts w:ascii="Bookman Old Style" w:eastAsia="Bookman Old Style" w:hAnsi="Bookman Old Style" w:cs="Bookman Old Style"/>
-          <w:color w:val="000000"/>
-          <w:sz w:val="24"/>
-          <w:szCs w:val="24"/>
-        </w:rPr>
-        <w:t>dipertanggungjawabkan</w:t>
-      </w:r>
-      <w:proofErr w:type="spellEnd"/>
-      <w:r>
-        <w:rPr>
-          <w:rFonts w:ascii="Bookman Old Style" w:eastAsia="Bookman Old Style" w:hAnsi="Bookman Old Style" w:cs="Bookman Old Style"/>
-          <w:color w:val="000000"/>
-          <w:sz w:val="24"/>
-          <w:szCs w:val="24"/>
-        </w:rPr>
-        <w:t xml:space="preserve"> </w:t>
-      </w:r>
-      <w:proofErr w:type="spellStart"/>
-      <w:r>
-        <w:rPr>
-          <w:rFonts w:ascii="Bookman Old Style" w:eastAsia="Bookman Old Style" w:hAnsi="Bookman Old Style" w:cs="Bookman Old Style"/>
-          <w:color w:val="000000"/>
-          <w:sz w:val="24"/>
-          <w:szCs w:val="24"/>
-        </w:rPr>
-        <w:t>sesuai</w:t>
-      </w:r>
-      <w:proofErr w:type="spellEnd"/>
-      <w:r>
-        <w:rPr>
-          <w:rFonts w:ascii="Bookman Old Style" w:eastAsia="Bookman Old Style" w:hAnsi="Bookman Old Style" w:cs="Bookman Old Style"/>
-          <w:color w:val="000000"/>
-          <w:sz w:val="24"/>
-          <w:szCs w:val="24"/>
-        </w:rPr>
-        <w:t xml:space="preserve"> </w:t>
-      </w:r>
-      <w:proofErr w:type="spellStart"/>
-      <w:r>
-        <w:rPr>
-          <w:rFonts w:ascii="Bookman Old Style" w:eastAsia="Bookman Old Style" w:hAnsi="Bookman Old Style" w:cs="Bookman Old Style"/>
-          <w:color w:val="000000"/>
-          <w:sz w:val="24"/>
-          <w:szCs w:val="24"/>
-        </w:rPr>
-        <w:t>dengan</w:t>
-      </w:r>
-      <w:proofErr w:type="spellEnd"/>
-      <w:r>
-        <w:rPr>
-          <w:rFonts w:ascii="Bookman Old Style" w:eastAsia="Bookman Old Style" w:hAnsi="Bookman Old Style" w:cs="Bookman Old Style"/>
-          <w:color w:val="000000"/>
-          <w:sz w:val="24"/>
-          <w:szCs w:val="24"/>
-        </w:rPr>
-        <w:t xml:space="preserve"> </w:t>
-      </w:r>
-      <w:proofErr w:type="spellStart"/>
-      <w:r>
-        <w:rPr>
-          <w:rFonts w:ascii="Bookman Old Style" w:eastAsia="Bookman Old Style" w:hAnsi="Bookman Old Style" w:cs="Bookman Old Style"/>
-          <w:color w:val="000000"/>
-          <w:sz w:val="24"/>
-          <w:szCs w:val="24"/>
-        </w:rPr>
-        <w:t>kondisi</w:t>
-      </w:r>
-      <w:proofErr w:type="spellEnd"/>
-      <w:r>
-        <w:rPr>
-          <w:rFonts w:ascii="Bookman Old Style" w:eastAsia="Bookman Old Style" w:hAnsi="Bookman Old Style" w:cs="Bookman Old Style"/>
-          <w:color w:val="000000"/>
-          <w:sz w:val="24"/>
-          <w:szCs w:val="24"/>
-        </w:rPr>
-        <w:t xml:space="preserve"> di </w:t>
-      </w:r>
-      <w:proofErr w:type="spellStart"/>
-      <w:r>
-        <w:rPr>
-          <w:rFonts w:ascii="Bookman Old Style" w:eastAsia="Bookman Old Style" w:hAnsi="Bookman Old Style" w:cs="Bookman Old Style"/>
-          <w:color w:val="000000"/>
-          <w:sz w:val="24"/>
-          <w:szCs w:val="24"/>
-        </w:rPr>
-        <w:t>lapangan</w:t>
-      </w:r>
-      <w:proofErr w:type="spellEnd"/>
+        <w:t>adalah benar, akurat, dan dapat dipertanggungjawabkan sesuai dengan kondisi di lapangan</w:t>
+      </w:r>
       <w:r>
         <w:rPr>
           <w:rFonts w:ascii="Bookman Old Style" w:eastAsia="Bookman Old Style" w:hAnsi="Bookman Old Style" w:cs="Bookman Old Style"/>
@@ -1803,412 +645,14 @@
           <w:szCs w:val="24"/>
         </w:rPr>
       </w:pPr>
-      <w:proofErr w:type="spellStart"/>
-      <w:r>
-        <w:rPr>
-          <w:rFonts w:ascii="Bookman Old Style" w:eastAsia="Bookman Old Style" w:hAnsi="Bookman Old Style" w:cs="Bookman Old Style"/>
-          <w:sz w:val="24"/>
-          <w:szCs w:val="24"/>
-        </w:rPr>
-        <w:t>apabila</w:t>
-      </w:r>
-      <w:proofErr w:type="spellEnd"/>
-      <w:r>
-        <w:rPr>
-          <w:rFonts w:ascii="Bookman Old Style" w:eastAsia="Bookman Old Style" w:hAnsi="Bookman Old Style" w:cs="Bookman Old Style"/>
-          <w:sz w:val="24"/>
-          <w:szCs w:val="24"/>
-        </w:rPr>
-        <w:t xml:space="preserve"> di </w:t>
-      </w:r>
-      <w:proofErr w:type="spellStart"/>
-      <w:r>
-        <w:rPr>
-          <w:rFonts w:ascii="Bookman Old Style" w:eastAsia="Bookman Old Style" w:hAnsi="Bookman Old Style" w:cs="Bookman Old Style"/>
-          <w:sz w:val="24"/>
-          <w:szCs w:val="24"/>
-        </w:rPr>
-        <w:t>kemudian</w:t>
-      </w:r>
-      <w:proofErr w:type="spellEnd"/>
-      <w:r>
-        <w:rPr>
-          <w:rFonts w:ascii="Bookman Old Style" w:eastAsia="Bookman Old Style" w:hAnsi="Bookman Old Style" w:cs="Bookman Old Style"/>
-          <w:sz w:val="24"/>
-          <w:szCs w:val="24"/>
-        </w:rPr>
-        <w:t xml:space="preserve"> </w:t>
-      </w:r>
-      <w:proofErr w:type="spellStart"/>
-      <w:r>
-        <w:rPr>
-          <w:rFonts w:ascii="Bookman Old Style" w:eastAsia="Bookman Old Style" w:hAnsi="Bookman Old Style" w:cs="Bookman Old Style"/>
-          <w:sz w:val="24"/>
-          <w:szCs w:val="24"/>
-        </w:rPr>
-        <w:t>hari</w:t>
-      </w:r>
-      <w:proofErr w:type="spellEnd"/>
-      <w:r>
-        <w:rPr>
-          <w:rFonts w:ascii="Bookman Old Style" w:eastAsia="Bookman Old Style" w:hAnsi="Bookman Old Style" w:cs="Bookman Old Style"/>
-          <w:sz w:val="24"/>
-          <w:szCs w:val="24"/>
-        </w:rPr>
-        <w:t xml:space="preserve"> </w:t>
-      </w:r>
-      <w:proofErr w:type="spellStart"/>
-      <w:r>
-        <w:rPr>
-          <w:rFonts w:ascii="Bookman Old Style" w:eastAsia="Bookman Old Style" w:hAnsi="Bookman Old Style" w:cs="Bookman Old Style"/>
-          <w:sz w:val="24"/>
-          <w:szCs w:val="24"/>
-        </w:rPr>
-        <w:t>ditemukan</w:t>
-      </w:r>
-      <w:proofErr w:type="spellEnd"/>
-      <w:r>
-        <w:rPr>
-          <w:rFonts w:ascii="Bookman Old Style" w:eastAsia="Bookman Old Style" w:hAnsi="Bookman Old Style" w:cs="Bookman Old Style"/>
-          <w:sz w:val="24"/>
-          <w:szCs w:val="24"/>
-        </w:rPr>
-        <w:t xml:space="preserve"> </w:t>
-      </w:r>
-      <w:proofErr w:type="spellStart"/>
-      <w:r>
-        <w:rPr>
-          <w:rFonts w:ascii="Bookman Old Style" w:eastAsia="Bookman Old Style" w:hAnsi="Bookman Old Style" w:cs="Bookman Old Style"/>
-          <w:sz w:val="24"/>
-          <w:szCs w:val="24"/>
-        </w:rPr>
-        <w:t>ketidaksesuaian</w:t>
-      </w:r>
-      <w:proofErr w:type="spellEnd"/>
-      <w:r>
-        <w:rPr>
-          <w:rFonts w:ascii="Bookman Old Style" w:eastAsia="Bookman Old Style" w:hAnsi="Bookman Old Style" w:cs="Bookman Old Style"/>
-          <w:sz w:val="24"/>
-          <w:szCs w:val="24"/>
-        </w:rPr>
-        <w:t xml:space="preserve">, </w:t>
-      </w:r>
-      <w:proofErr w:type="spellStart"/>
-      <w:r>
-        <w:rPr>
-          <w:rFonts w:ascii="Bookman Old Style" w:eastAsia="Bookman Old Style" w:hAnsi="Bookman Old Style" w:cs="Bookman Old Style"/>
-          <w:sz w:val="24"/>
-          <w:szCs w:val="24"/>
-        </w:rPr>
-        <w:t>kekeliruan</w:t>
-      </w:r>
-      <w:proofErr w:type="spellEnd"/>
-      <w:r>
-        <w:rPr>
-          <w:rFonts w:ascii="Bookman Old Style" w:eastAsia="Bookman Old Style" w:hAnsi="Bookman Old Style" w:cs="Bookman Old Style"/>
-          <w:sz w:val="24"/>
-          <w:szCs w:val="24"/>
-        </w:rPr>
-        <w:t xml:space="preserve">, </w:t>
-      </w:r>
-      <w:proofErr w:type="spellStart"/>
-      <w:r>
-        <w:rPr>
-          <w:rFonts w:ascii="Bookman Old Style" w:eastAsia="Bookman Old Style" w:hAnsi="Bookman Old Style" w:cs="Bookman Old Style"/>
-          <w:sz w:val="24"/>
-          <w:szCs w:val="24"/>
-        </w:rPr>
-        <w:t>atau</w:t>
-      </w:r>
-      <w:proofErr w:type="spellEnd"/>
-      <w:r>
-        <w:rPr>
-          <w:rFonts w:ascii="Bookman Old Style" w:eastAsia="Bookman Old Style" w:hAnsi="Bookman Old Style" w:cs="Bookman Old Style"/>
-          <w:sz w:val="24"/>
-          <w:szCs w:val="24"/>
-        </w:rPr>
-        <w:t xml:space="preserve"> </w:t>
-      </w:r>
-      <w:proofErr w:type="spellStart"/>
-      <w:r>
-        <w:rPr>
-          <w:rFonts w:ascii="Bookman Old Style" w:eastAsia="Bookman Old Style" w:hAnsi="Bookman Old Style" w:cs="Bookman Old Style"/>
-          <w:sz w:val="24"/>
-          <w:szCs w:val="24"/>
-        </w:rPr>
-        <w:t>penyimpangan</w:t>
-      </w:r>
-      <w:proofErr w:type="spellEnd"/>
-      <w:r>
-        <w:rPr>
-          <w:rFonts w:ascii="Bookman Old Style" w:eastAsia="Bookman Old Style" w:hAnsi="Bookman Old Style" w:cs="Bookman Old Style"/>
-          <w:sz w:val="24"/>
-          <w:szCs w:val="24"/>
-        </w:rPr>
-        <w:t xml:space="preserve"> </w:t>
-      </w:r>
-      <w:proofErr w:type="spellStart"/>
-      <w:r>
-        <w:rPr>
-          <w:rFonts w:ascii="Bookman Old Style" w:eastAsia="Bookman Old Style" w:hAnsi="Bookman Old Style" w:cs="Bookman Old Style"/>
-          <w:sz w:val="24"/>
-          <w:szCs w:val="24"/>
-        </w:rPr>
-        <w:t>atas</w:t>
-      </w:r>
-      <w:proofErr w:type="spellEnd"/>
-      <w:r>
-        <w:rPr>
-          <w:rFonts w:ascii="Bookman Old Style" w:eastAsia="Bookman Old Style" w:hAnsi="Bookman Old Style" w:cs="Bookman Old Style"/>
-          <w:sz w:val="24"/>
-          <w:szCs w:val="24"/>
-        </w:rPr>
-        <w:t xml:space="preserve"> </w:t>
-      </w:r>
-      <w:proofErr w:type="spellStart"/>
-      <w:r>
-        <w:rPr>
-          <w:rFonts w:ascii="Bookman Old Style" w:eastAsia="Bookman Old Style" w:hAnsi="Bookman Old Style" w:cs="Bookman Old Style"/>
-          <w:sz w:val="24"/>
-          <w:szCs w:val="24"/>
-        </w:rPr>
-        <w:t>pekerjaan</w:t>
-      </w:r>
-      <w:proofErr w:type="spellEnd"/>
-      <w:r>
-        <w:rPr>
-          <w:rFonts w:ascii="Bookman Old Style" w:eastAsia="Bookman Old Style" w:hAnsi="Bookman Old Style" w:cs="Bookman Old Style"/>
-          <w:sz w:val="24"/>
-          <w:szCs w:val="24"/>
-        </w:rPr>
-        <w:t xml:space="preserve"> yang </w:t>
-      </w:r>
-      <w:proofErr w:type="spellStart"/>
-      <w:r>
-        <w:rPr>
-          <w:rFonts w:ascii="Bookman Old Style" w:eastAsia="Bookman Old Style" w:hAnsi="Bookman Old Style" w:cs="Bookman Old Style"/>
-          <w:sz w:val="24"/>
-          <w:szCs w:val="24"/>
-        </w:rPr>
-        <w:t>saya</w:t>
-      </w:r>
-      <w:proofErr w:type="spellEnd"/>
-      <w:r>
-        <w:rPr>
-          <w:rFonts w:ascii="Bookman Old Style" w:eastAsia="Bookman Old Style" w:hAnsi="Bookman Old Style" w:cs="Bookman Old Style"/>
-          <w:sz w:val="24"/>
-          <w:szCs w:val="24"/>
-        </w:rPr>
-        <w:t xml:space="preserve"> </w:t>
-      </w:r>
-      <w:proofErr w:type="spellStart"/>
-      <w:r>
-        <w:rPr>
-          <w:rFonts w:ascii="Bookman Old Style" w:eastAsia="Bookman Old Style" w:hAnsi="Bookman Old Style" w:cs="Bookman Old Style"/>
-          <w:sz w:val="24"/>
-          <w:szCs w:val="24"/>
-        </w:rPr>
-        <w:t>lakukan</w:t>
-      </w:r>
-      <w:proofErr w:type="spellEnd"/>
-      <w:r>
-        <w:rPr>
-          <w:rFonts w:ascii="Bookman Old Style" w:eastAsia="Bookman Old Style" w:hAnsi="Bookman Old Style" w:cs="Bookman Old Style"/>
-          <w:sz w:val="24"/>
-          <w:szCs w:val="24"/>
-        </w:rPr>
-        <w:t xml:space="preserve">, </w:t>
-      </w:r>
-      <w:proofErr w:type="spellStart"/>
-      <w:r>
-        <w:rPr>
-          <w:rFonts w:ascii="Bookman Old Style" w:eastAsia="Bookman Old Style" w:hAnsi="Bookman Old Style" w:cs="Bookman Old Style"/>
-          <w:sz w:val="24"/>
-          <w:szCs w:val="24"/>
-        </w:rPr>
-        <w:t>maka</w:t>
-      </w:r>
-      <w:proofErr w:type="spellEnd"/>
-      <w:r>
-        <w:rPr>
-          <w:rFonts w:ascii="Bookman Old Style" w:eastAsia="Bookman Old Style" w:hAnsi="Bookman Old Style" w:cs="Bookman Old Style"/>
-          <w:sz w:val="24"/>
-          <w:szCs w:val="24"/>
-        </w:rPr>
-        <w:t xml:space="preserve"> </w:t>
-      </w:r>
-      <w:proofErr w:type="spellStart"/>
-      <w:r>
-        <w:rPr>
-          <w:rFonts w:ascii="Bookman Old Style" w:eastAsia="Bookman Old Style" w:hAnsi="Bookman Old Style" w:cs="Bookman Old Style"/>
-          <w:sz w:val="24"/>
-          <w:szCs w:val="24"/>
-        </w:rPr>
-        <w:t>saya</w:t>
-      </w:r>
-      <w:proofErr w:type="spellEnd"/>
-      <w:r>
-        <w:rPr>
-          <w:rFonts w:ascii="Bookman Old Style" w:eastAsia="Bookman Old Style" w:hAnsi="Bookman Old Style" w:cs="Bookman Old Style"/>
-          <w:sz w:val="24"/>
-          <w:szCs w:val="24"/>
-        </w:rPr>
-        <w:t xml:space="preserve"> </w:t>
-      </w:r>
-      <w:proofErr w:type="spellStart"/>
-      <w:r>
-        <w:rPr>
-          <w:rFonts w:ascii="Bookman Old Style" w:eastAsia="Bookman Old Style" w:hAnsi="Bookman Old Style" w:cs="Bookman Old Style"/>
-          <w:sz w:val="24"/>
-          <w:szCs w:val="24"/>
-        </w:rPr>
-        <w:t>bersedia</w:t>
-      </w:r>
-      <w:proofErr w:type="spellEnd"/>
-      <w:r>
-        <w:rPr>
-          <w:rFonts w:ascii="Bookman Old Style" w:eastAsia="Bookman Old Style" w:hAnsi="Bookman Old Style" w:cs="Bookman Old Style"/>
-          <w:sz w:val="24"/>
-          <w:szCs w:val="24"/>
-        </w:rPr>
-        <w:t xml:space="preserve"> </w:t>
-      </w:r>
-      <w:proofErr w:type="spellStart"/>
-      <w:r>
-        <w:rPr>
-          <w:rFonts w:ascii="Bookman Old Style" w:eastAsia="Bookman Old Style" w:hAnsi="Bookman Old Style" w:cs="Bookman Old Style"/>
-          <w:sz w:val="24"/>
-          <w:szCs w:val="24"/>
-        </w:rPr>
-        <w:t>bertanggung</w:t>
-      </w:r>
-      <w:proofErr w:type="spellEnd"/>
-      <w:r>
-        <w:rPr>
-          <w:rFonts w:ascii="Bookman Old Style" w:eastAsia="Bookman Old Style" w:hAnsi="Bookman Old Style" w:cs="Bookman Old Style"/>
-          <w:sz w:val="24"/>
-          <w:szCs w:val="24"/>
-        </w:rPr>
-        <w:t xml:space="preserve"> </w:t>
-      </w:r>
-      <w:proofErr w:type="spellStart"/>
-      <w:r>
-        <w:rPr>
-          <w:rFonts w:ascii="Bookman Old Style" w:eastAsia="Bookman Old Style" w:hAnsi="Bookman Old Style" w:cs="Bookman Old Style"/>
-          <w:sz w:val="24"/>
-          <w:szCs w:val="24"/>
-        </w:rPr>
-        <w:t>jawab</w:t>
-      </w:r>
-      <w:proofErr w:type="spellEnd"/>
-      <w:r>
-        <w:rPr>
-          <w:rFonts w:ascii="Bookman Old Style" w:eastAsia="Bookman Old Style" w:hAnsi="Bookman Old Style" w:cs="Bookman Old Style"/>
-          <w:sz w:val="24"/>
-          <w:szCs w:val="24"/>
-        </w:rPr>
-        <w:t xml:space="preserve"> </w:t>
-      </w:r>
-      <w:proofErr w:type="spellStart"/>
-      <w:r>
-        <w:rPr>
-          <w:rFonts w:ascii="Bookman Old Style" w:eastAsia="Bookman Old Style" w:hAnsi="Bookman Old Style" w:cs="Bookman Old Style"/>
-          <w:sz w:val="24"/>
-          <w:szCs w:val="24"/>
-        </w:rPr>
-        <w:t>sepenuhnya</w:t>
-      </w:r>
-      <w:proofErr w:type="spellEnd"/>
-      <w:r>
-        <w:rPr>
-          <w:rFonts w:ascii="Bookman Old Style" w:eastAsia="Bookman Old Style" w:hAnsi="Bookman Old Style" w:cs="Bookman Old Style"/>
-          <w:sz w:val="24"/>
-          <w:szCs w:val="24"/>
-        </w:rPr>
-        <w:t xml:space="preserve"> </w:t>
-      </w:r>
-      <w:proofErr w:type="spellStart"/>
-      <w:r>
-        <w:rPr>
-          <w:rFonts w:ascii="Bookman Old Style" w:eastAsia="Bookman Old Style" w:hAnsi="Bookman Old Style" w:cs="Bookman Old Style"/>
-          <w:sz w:val="24"/>
-          <w:szCs w:val="24"/>
-        </w:rPr>
-        <w:t>sesuai</w:t>
-      </w:r>
-      <w:proofErr w:type="spellEnd"/>
-      <w:r>
-        <w:rPr>
-          <w:rFonts w:ascii="Bookman Old Style" w:eastAsia="Bookman Old Style" w:hAnsi="Bookman Old Style" w:cs="Bookman Old Style"/>
-          <w:sz w:val="24"/>
-          <w:szCs w:val="24"/>
-        </w:rPr>
-        <w:t xml:space="preserve"> </w:t>
-      </w:r>
-      <w:proofErr w:type="spellStart"/>
-      <w:r>
-        <w:rPr>
-          <w:rFonts w:ascii="Bookman Old Style" w:eastAsia="Bookman Old Style" w:hAnsi="Bookman Old Style" w:cs="Bookman Old Style"/>
-          <w:sz w:val="24"/>
-          <w:szCs w:val="24"/>
-        </w:rPr>
-        <w:t>dengan</w:t>
-      </w:r>
-      <w:proofErr w:type="spellEnd"/>
-      <w:r>
-        <w:rPr>
-          <w:rFonts w:ascii="Bookman Old Style" w:eastAsia="Bookman Old Style" w:hAnsi="Bookman Old Style" w:cs="Bookman Old Style"/>
-          <w:sz w:val="24"/>
-          <w:szCs w:val="24"/>
-        </w:rPr>
-        <w:t xml:space="preserve"> </w:t>
-      </w:r>
-      <w:proofErr w:type="spellStart"/>
-      <w:r>
-        <w:rPr>
-          <w:rFonts w:ascii="Bookman Old Style" w:eastAsia="Bookman Old Style" w:hAnsi="Bookman Old Style" w:cs="Bookman Old Style"/>
-          <w:sz w:val="24"/>
-          <w:szCs w:val="24"/>
-        </w:rPr>
-        <w:t>ketentuan</w:t>
-      </w:r>
-      <w:proofErr w:type="spellEnd"/>
-      <w:r>
-        <w:rPr>
-          <w:rFonts w:ascii="Bookman Old Style" w:eastAsia="Bookman Old Style" w:hAnsi="Bookman Old Style" w:cs="Bookman Old Style"/>
-          <w:sz w:val="24"/>
-          <w:szCs w:val="24"/>
-        </w:rPr>
-        <w:t xml:space="preserve"> </w:t>
-      </w:r>
-      <w:proofErr w:type="spellStart"/>
-      <w:r>
-        <w:rPr>
-          <w:rFonts w:ascii="Bookman Old Style" w:eastAsia="Bookman Old Style" w:hAnsi="Bookman Old Style" w:cs="Bookman Old Style"/>
-          <w:sz w:val="24"/>
-          <w:szCs w:val="24"/>
-        </w:rPr>
-        <w:t>peraturan</w:t>
-      </w:r>
-      <w:proofErr w:type="spellEnd"/>
-      <w:r>
-        <w:rPr>
-          <w:rFonts w:ascii="Bookman Old Style" w:eastAsia="Bookman Old Style" w:hAnsi="Bookman Old Style" w:cs="Bookman Old Style"/>
-          <w:sz w:val="24"/>
-          <w:szCs w:val="24"/>
-        </w:rPr>
-        <w:t xml:space="preserve"> </w:t>
-      </w:r>
-      <w:proofErr w:type="spellStart"/>
-      <w:r>
-        <w:rPr>
-          <w:rFonts w:ascii="Bookman Old Style" w:eastAsia="Bookman Old Style" w:hAnsi="Bookman Old Style" w:cs="Bookman Old Style"/>
-          <w:sz w:val="24"/>
-          <w:szCs w:val="24"/>
-        </w:rPr>
-        <w:t>perundang-undangan</w:t>
-      </w:r>
-      <w:proofErr w:type="spellEnd"/>
+      <w:r>
+        <w:rPr>
+          <w:rFonts w:ascii="Bookman Old Style" w:eastAsia="Bookman Old Style" w:hAnsi="Bookman Old Style" w:cs="Bookman Old Style"/>
+          <w:sz w:val="24"/>
+          <w:szCs w:val="24"/>
+        </w:rPr>
+        <w:t>apabila di kemudian hari ditemukan ketidaksesuaian, kekeliruan, atau penyimpangan atas pekerjaan yang saya lakukan, maka saya bersedia bertanggung jawab sepenuhnya sesuai dengan ketentuan peraturan perundang-undangan</w:t>
+      </w:r>
       <w:r>
         <w:rPr>
           <w:rFonts w:ascii="Bookman Old Style" w:eastAsia="Bookman Old Style" w:hAnsi="Bookman Old Style" w:cs="Bookman Old Style"/>
@@ -2241,7 +685,6 @@
           <w:szCs w:val="24"/>
         </w:rPr>
       </w:pPr>
-      <w:proofErr w:type="spellStart"/>
       <w:r>
         <w:rPr>
           <w:rFonts w:ascii="Bookman Old Style" w:eastAsia="Bookman Old Style" w:hAnsi="Bookman Old Style" w:cs="Bookman Old Style"/>
@@ -2249,357 +692,7 @@
           <w:sz w:val="24"/>
           <w:szCs w:val="24"/>
         </w:rPr>
-        <w:t>Demikian</w:t>
-      </w:r>
-      <w:proofErr w:type="spellEnd"/>
-      <w:r>
-        <w:rPr>
-          <w:rFonts w:ascii="Bookman Old Style" w:eastAsia="Bookman Old Style" w:hAnsi="Bookman Old Style" w:cs="Bookman Old Style"/>
-          <w:color w:val="000000"/>
-          <w:sz w:val="24"/>
-          <w:szCs w:val="24"/>
-        </w:rPr>
-        <w:t xml:space="preserve"> Surat </w:t>
-      </w:r>
-      <w:proofErr w:type="spellStart"/>
-      <w:r>
-        <w:rPr>
-          <w:rFonts w:ascii="Bookman Old Style" w:eastAsia="Bookman Old Style" w:hAnsi="Bookman Old Style" w:cs="Bookman Old Style"/>
-          <w:color w:val="000000"/>
-          <w:sz w:val="24"/>
-          <w:szCs w:val="24"/>
-        </w:rPr>
-        <w:t>Pernyataan</w:t>
-      </w:r>
-      <w:proofErr w:type="spellEnd"/>
-      <w:r>
-        <w:rPr>
-          <w:rFonts w:ascii="Bookman Old Style" w:eastAsia="Bookman Old Style" w:hAnsi="Bookman Old Style" w:cs="Bookman Old Style"/>
-          <w:color w:val="000000"/>
-          <w:sz w:val="24"/>
-          <w:szCs w:val="24"/>
-        </w:rPr>
-        <w:t xml:space="preserve"> </w:t>
-      </w:r>
-      <w:proofErr w:type="spellStart"/>
-      <w:r>
-        <w:rPr>
-          <w:rFonts w:ascii="Bookman Old Style" w:eastAsia="Bookman Old Style" w:hAnsi="Bookman Old Style" w:cs="Bookman Old Style"/>
-          <w:color w:val="000000"/>
-          <w:sz w:val="24"/>
-          <w:szCs w:val="24"/>
-        </w:rPr>
-        <w:t>ini</w:t>
-      </w:r>
-      <w:proofErr w:type="spellEnd"/>
-      <w:r>
-        <w:rPr>
-          <w:rFonts w:ascii="Bookman Old Style" w:eastAsia="Bookman Old Style" w:hAnsi="Bookman Old Style" w:cs="Bookman Old Style"/>
-          <w:color w:val="000000"/>
-          <w:sz w:val="24"/>
-          <w:szCs w:val="24"/>
-        </w:rPr>
-        <w:t xml:space="preserve"> </w:t>
-      </w:r>
-      <w:proofErr w:type="spellStart"/>
-      <w:r>
-        <w:rPr>
-          <w:rFonts w:ascii="Bookman Old Style" w:eastAsia="Bookman Old Style" w:hAnsi="Bookman Old Style" w:cs="Bookman Old Style"/>
-          <w:color w:val="000000"/>
-          <w:sz w:val="24"/>
-          <w:szCs w:val="24"/>
-        </w:rPr>
-        <w:t>dibuat</w:t>
-      </w:r>
-      <w:proofErr w:type="spellEnd"/>
-      <w:r>
-        <w:rPr>
-          <w:rFonts w:ascii="Bookman Old Style" w:eastAsia="Bookman Old Style" w:hAnsi="Bookman Old Style" w:cs="Bookman Old Style"/>
-          <w:color w:val="000000"/>
-          <w:sz w:val="24"/>
-          <w:szCs w:val="24"/>
-        </w:rPr>
-        <w:t xml:space="preserve"> </w:t>
-      </w:r>
-      <w:proofErr w:type="spellStart"/>
-      <w:r>
-        <w:rPr>
-          <w:rFonts w:ascii="Bookman Old Style" w:eastAsia="Bookman Old Style" w:hAnsi="Bookman Old Style" w:cs="Bookman Old Style"/>
-          <w:color w:val="000000"/>
-          <w:sz w:val="24"/>
-          <w:szCs w:val="24"/>
-        </w:rPr>
-        <w:t>dengan</w:t>
-      </w:r>
-      <w:proofErr w:type="spellEnd"/>
-      <w:r>
-        <w:rPr>
-          <w:rFonts w:ascii="Bookman Old Style" w:eastAsia="Bookman Old Style" w:hAnsi="Bookman Old Style" w:cs="Bookman Old Style"/>
-          <w:color w:val="000000"/>
-          <w:sz w:val="24"/>
-          <w:szCs w:val="24"/>
-        </w:rPr>
-        <w:t xml:space="preserve"> </w:t>
-      </w:r>
-      <w:proofErr w:type="spellStart"/>
-      <w:r>
-        <w:rPr>
-          <w:rFonts w:ascii="Bookman Old Style" w:eastAsia="Bookman Old Style" w:hAnsi="Bookman Old Style" w:cs="Bookman Old Style"/>
-          <w:color w:val="000000"/>
-          <w:sz w:val="24"/>
-          <w:szCs w:val="24"/>
-        </w:rPr>
-        <w:t>sebenarnya</w:t>
-      </w:r>
-      <w:proofErr w:type="spellEnd"/>
-      <w:r>
-        <w:rPr>
-          <w:rFonts w:ascii="Bookman Old Style" w:eastAsia="Bookman Old Style" w:hAnsi="Bookman Old Style" w:cs="Bookman Old Style"/>
-          <w:color w:val="000000"/>
-          <w:sz w:val="24"/>
-          <w:szCs w:val="24"/>
-        </w:rPr>
-        <w:t xml:space="preserve"> </w:t>
-      </w:r>
-      <w:proofErr w:type="spellStart"/>
-      <w:r>
-        <w:rPr>
-          <w:rFonts w:ascii="Bookman Old Style" w:eastAsia="Bookman Old Style" w:hAnsi="Bookman Old Style" w:cs="Bookman Old Style"/>
-          <w:color w:val="000000"/>
-          <w:sz w:val="24"/>
-          <w:szCs w:val="24"/>
-        </w:rPr>
-        <w:t>dalam</w:t>
-      </w:r>
-      <w:proofErr w:type="spellEnd"/>
-      <w:r>
-        <w:rPr>
-          <w:rFonts w:ascii="Bookman Old Style" w:eastAsia="Bookman Old Style" w:hAnsi="Bookman Old Style" w:cs="Bookman Old Style"/>
-          <w:color w:val="000000"/>
-          <w:sz w:val="24"/>
-          <w:szCs w:val="24"/>
-        </w:rPr>
-        <w:t xml:space="preserve"> </w:t>
-      </w:r>
-      <w:proofErr w:type="spellStart"/>
-      <w:r>
-        <w:rPr>
-          <w:rFonts w:ascii="Bookman Old Style" w:eastAsia="Bookman Old Style" w:hAnsi="Bookman Old Style" w:cs="Bookman Old Style"/>
-          <w:color w:val="000000"/>
-          <w:sz w:val="24"/>
-          <w:szCs w:val="24"/>
-        </w:rPr>
-        <w:t>keadaan</w:t>
-      </w:r>
-      <w:proofErr w:type="spellEnd"/>
-      <w:r>
-        <w:rPr>
-          <w:rFonts w:ascii="Bookman Old Style" w:eastAsia="Bookman Old Style" w:hAnsi="Bookman Old Style" w:cs="Bookman Old Style"/>
-          <w:color w:val="000000"/>
-          <w:sz w:val="24"/>
-          <w:szCs w:val="24"/>
-        </w:rPr>
-        <w:t xml:space="preserve"> </w:t>
-      </w:r>
-      <w:proofErr w:type="spellStart"/>
-      <w:r>
-        <w:rPr>
-          <w:rFonts w:ascii="Bookman Old Style" w:eastAsia="Bookman Old Style" w:hAnsi="Bookman Old Style" w:cs="Bookman Old Style"/>
-          <w:color w:val="000000"/>
-          <w:sz w:val="24"/>
-          <w:szCs w:val="24"/>
-        </w:rPr>
-        <w:t>sadar</w:t>
-      </w:r>
-      <w:proofErr w:type="spellEnd"/>
-      <w:r>
-        <w:rPr>
-          <w:rFonts w:ascii="Bookman Old Style" w:eastAsia="Bookman Old Style" w:hAnsi="Bookman Old Style" w:cs="Bookman Old Style"/>
-          <w:color w:val="000000"/>
-          <w:sz w:val="24"/>
-          <w:szCs w:val="24"/>
-        </w:rPr>
-        <w:t xml:space="preserve">, </w:t>
-      </w:r>
-      <w:proofErr w:type="spellStart"/>
-      <w:r>
-        <w:rPr>
-          <w:rFonts w:ascii="Bookman Old Style" w:eastAsia="Bookman Old Style" w:hAnsi="Bookman Old Style" w:cs="Bookman Old Style"/>
-          <w:color w:val="000000"/>
-          <w:sz w:val="24"/>
-          <w:szCs w:val="24"/>
-        </w:rPr>
-        <w:t>tanpa</w:t>
-      </w:r>
-      <w:proofErr w:type="spellEnd"/>
-      <w:r>
-        <w:rPr>
-          <w:rFonts w:ascii="Bookman Old Style" w:eastAsia="Bookman Old Style" w:hAnsi="Bookman Old Style" w:cs="Bookman Old Style"/>
-          <w:color w:val="000000"/>
-          <w:sz w:val="24"/>
-          <w:szCs w:val="24"/>
-        </w:rPr>
-        <w:t xml:space="preserve"> </w:t>
-      </w:r>
-      <w:proofErr w:type="spellStart"/>
-      <w:r>
-        <w:rPr>
-          <w:rFonts w:ascii="Bookman Old Style" w:eastAsia="Bookman Old Style" w:hAnsi="Bookman Old Style" w:cs="Bookman Old Style"/>
-          <w:color w:val="000000"/>
-          <w:sz w:val="24"/>
-          <w:szCs w:val="24"/>
-        </w:rPr>
-        <w:t>paksaan</w:t>
-      </w:r>
-      <w:proofErr w:type="spellEnd"/>
-      <w:r>
-        <w:rPr>
-          <w:rFonts w:ascii="Bookman Old Style" w:eastAsia="Bookman Old Style" w:hAnsi="Bookman Old Style" w:cs="Bookman Old Style"/>
-          <w:color w:val="000000"/>
-          <w:sz w:val="24"/>
-          <w:szCs w:val="24"/>
-        </w:rPr>
-        <w:t xml:space="preserve"> </w:t>
-      </w:r>
-      <w:proofErr w:type="spellStart"/>
-      <w:r>
-        <w:rPr>
-          <w:rFonts w:ascii="Bookman Old Style" w:eastAsia="Bookman Old Style" w:hAnsi="Bookman Old Style" w:cs="Bookman Old Style"/>
-          <w:color w:val="000000"/>
-          <w:sz w:val="24"/>
-          <w:szCs w:val="24"/>
-        </w:rPr>
-        <w:t>dari</w:t>
-      </w:r>
-      <w:proofErr w:type="spellEnd"/>
-      <w:r>
-        <w:rPr>
-          <w:rFonts w:ascii="Bookman Old Style" w:eastAsia="Bookman Old Style" w:hAnsi="Bookman Old Style" w:cs="Bookman Old Style"/>
-          <w:color w:val="000000"/>
-          <w:sz w:val="24"/>
-          <w:szCs w:val="24"/>
-        </w:rPr>
-        <w:t xml:space="preserve"> </w:t>
-      </w:r>
-      <w:proofErr w:type="spellStart"/>
-      <w:r>
-        <w:rPr>
-          <w:rFonts w:ascii="Bookman Old Style" w:eastAsia="Bookman Old Style" w:hAnsi="Bookman Old Style" w:cs="Bookman Old Style"/>
-          <w:color w:val="000000"/>
-          <w:sz w:val="24"/>
-          <w:szCs w:val="24"/>
-        </w:rPr>
-        <w:t>pihak</w:t>
-      </w:r>
-      <w:proofErr w:type="spellEnd"/>
-      <w:r>
-        <w:rPr>
-          <w:rFonts w:ascii="Bookman Old Style" w:eastAsia="Bookman Old Style" w:hAnsi="Bookman Old Style" w:cs="Bookman Old Style"/>
-          <w:color w:val="000000"/>
-          <w:sz w:val="24"/>
-          <w:szCs w:val="24"/>
-        </w:rPr>
-        <w:t xml:space="preserve"> </w:t>
-      </w:r>
-      <w:proofErr w:type="spellStart"/>
-      <w:r>
-        <w:rPr>
-          <w:rFonts w:ascii="Bookman Old Style" w:eastAsia="Bookman Old Style" w:hAnsi="Bookman Old Style" w:cs="Bookman Old Style"/>
-          <w:color w:val="000000"/>
-          <w:sz w:val="24"/>
-          <w:szCs w:val="24"/>
-        </w:rPr>
-        <w:t>manapun</w:t>
-      </w:r>
-      <w:proofErr w:type="spellEnd"/>
-      <w:r>
-        <w:rPr>
-          <w:rFonts w:ascii="Bookman Old Style" w:eastAsia="Bookman Old Style" w:hAnsi="Bookman Old Style" w:cs="Bookman Old Style"/>
-          <w:color w:val="000000"/>
-          <w:sz w:val="24"/>
-          <w:szCs w:val="24"/>
-        </w:rPr>
-        <w:t xml:space="preserve">, </w:t>
-      </w:r>
-      <w:proofErr w:type="spellStart"/>
-      <w:r>
-        <w:rPr>
-          <w:rFonts w:ascii="Bookman Old Style" w:eastAsia="Bookman Old Style" w:hAnsi="Bookman Old Style" w:cs="Bookman Old Style"/>
-          <w:color w:val="000000"/>
-          <w:sz w:val="24"/>
-          <w:szCs w:val="24"/>
-        </w:rPr>
-        <w:t>untuk</w:t>
-      </w:r>
-      <w:proofErr w:type="spellEnd"/>
-      <w:r>
-        <w:rPr>
-          <w:rFonts w:ascii="Bookman Old Style" w:eastAsia="Bookman Old Style" w:hAnsi="Bookman Old Style" w:cs="Bookman Old Style"/>
-          <w:color w:val="000000"/>
-          <w:sz w:val="24"/>
-          <w:szCs w:val="24"/>
-        </w:rPr>
-        <w:t xml:space="preserve"> </w:t>
-      </w:r>
-      <w:proofErr w:type="spellStart"/>
-      <w:r>
-        <w:rPr>
-          <w:rFonts w:ascii="Bookman Old Style" w:eastAsia="Bookman Old Style" w:hAnsi="Bookman Old Style" w:cs="Bookman Old Style"/>
-          <w:color w:val="000000"/>
-          <w:sz w:val="24"/>
-          <w:szCs w:val="24"/>
-        </w:rPr>
-        <w:t>digunakan</w:t>
-      </w:r>
-      <w:proofErr w:type="spellEnd"/>
-      <w:r>
-        <w:rPr>
-          <w:rFonts w:ascii="Bookman Old Style" w:eastAsia="Bookman Old Style" w:hAnsi="Bookman Old Style" w:cs="Bookman Old Style"/>
-          <w:color w:val="000000"/>
-          <w:sz w:val="24"/>
-          <w:szCs w:val="24"/>
-        </w:rPr>
-        <w:t xml:space="preserve"> </w:t>
-      </w:r>
-      <w:proofErr w:type="spellStart"/>
-      <w:r>
-        <w:rPr>
-          <w:rFonts w:ascii="Bookman Old Style" w:eastAsia="Bookman Old Style" w:hAnsi="Bookman Old Style" w:cs="Bookman Old Style"/>
-          <w:color w:val="000000"/>
-          <w:sz w:val="24"/>
-          <w:szCs w:val="24"/>
-        </w:rPr>
-        <w:t>sebagaimana</w:t>
-      </w:r>
-      <w:proofErr w:type="spellEnd"/>
-      <w:r>
-        <w:rPr>
-          <w:rFonts w:ascii="Bookman Old Style" w:eastAsia="Bookman Old Style" w:hAnsi="Bookman Old Style" w:cs="Bookman Old Style"/>
-          <w:color w:val="000000"/>
-          <w:sz w:val="24"/>
-          <w:szCs w:val="24"/>
-        </w:rPr>
-        <w:t xml:space="preserve"> </w:t>
-      </w:r>
-      <w:proofErr w:type="spellStart"/>
-      <w:r>
-        <w:rPr>
-          <w:rFonts w:ascii="Bookman Old Style" w:eastAsia="Bookman Old Style" w:hAnsi="Bookman Old Style" w:cs="Bookman Old Style"/>
-          <w:color w:val="000000"/>
-          <w:sz w:val="24"/>
-          <w:szCs w:val="24"/>
-        </w:rPr>
-        <w:t>mestinya</w:t>
-      </w:r>
-      <w:proofErr w:type="spellEnd"/>
-      <w:r>
-        <w:rPr>
-          <w:rFonts w:ascii="Bookman Old Style" w:eastAsia="Bookman Old Style" w:hAnsi="Bookman Old Style" w:cs="Bookman Old Style"/>
-          <w:color w:val="000000"/>
-          <w:sz w:val="24"/>
-          <w:szCs w:val="24"/>
-        </w:rPr>
-        <w:t>.      </w:t>
+        <w:t>Demikian Surat Pernyataan ini dibuat dengan sebenarnya dalam keadaan sadar, tanpa paksaan dari pihak manapun, untuk digunakan sebagaimana mestinya.      </w:t>
       </w:r>
     </w:p>
     <w:p>
@@ -2699,47 +792,7 @@
                 <w:sz w:val="24"/>
                 <w:szCs w:val="24"/>
               </w:rPr>
-              <w:t xml:space="preserve">Yang </w:t>
-            </w:r>
-            <w:proofErr w:type="spellStart"/>
-            <w:r>
-              <w:rPr>
-                <w:rFonts w:ascii="Bookman Old Style" w:eastAsia="Bookman Old Style" w:hAnsi="Bookman Old Style" w:cs="Bookman Old Style"/>
-                <w:color w:val="000000"/>
-                <w:sz w:val="24"/>
-                <w:szCs w:val="24"/>
-              </w:rPr>
-              <w:t>membuat</w:t>
-            </w:r>
-            <w:proofErr w:type="spellEnd"/>
-            <w:r>
-              <w:rPr>
-                <w:rFonts w:ascii="Bookman Old Style" w:eastAsia="Bookman Old Style" w:hAnsi="Bookman Old Style" w:cs="Bookman Old Style"/>
-                <w:color w:val="000000"/>
-                <w:sz w:val="24"/>
-                <w:szCs w:val="24"/>
-              </w:rPr>
-              <w:t xml:space="preserve"> </w:t>
-            </w:r>
-            <w:proofErr w:type="spellStart"/>
-            <w:r>
-              <w:rPr>
-                <w:rFonts w:ascii="Bookman Old Style" w:eastAsia="Bookman Old Style" w:hAnsi="Bookman Old Style" w:cs="Bookman Old Style"/>
-                <w:color w:val="000000"/>
-                <w:sz w:val="24"/>
-                <w:szCs w:val="24"/>
-              </w:rPr>
-              <w:t>pernyataan</w:t>
-            </w:r>
-            <w:proofErr w:type="spellEnd"/>
-            <w:r>
-              <w:rPr>
-                <w:rFonts w:ascii="Bookman Old Style" w:eastAsia="Bookman Old Style" w:hAnsi="Bookman Old Style" w:cs="Bookman Old Style"/>
-                <w:color w:val="000000"/>
-                <w:sz w:val="24"/>
-                <w:szCs w:val="24"/>
-              </w:rPr>
-              <w:t>,</w:t>
+              <w:t>Yang membuat pernyataan,</w:t>
             </w:r>
           </w:p>
           <w:p>
@@ -2794,27 +847,7 @@
                 <w:sz w:val="24"/>
                 <w:szCs w:val="24"/>
               </w:rPr>
-              <w:t>{{</w:t>
-            </w:r>
-            <w:proofErr w:type="spellStart"/>
-            <w:r>
-              <w:rPr>
-                <w:rFonts w:ascii="Bookman Old Style" w:eastAsia="Bookman Old Style" w:hAnsi="Bookman Old Style" w:cs="Bookman Old Style"/>
-                <w:color w:val="FF0000"/>
-                <w:sz w:val="24"/>
-                <w:szCs w:val="24"/>
-              </w:rPr>
-              <w:t>nama_lengkap</w:t>
-            </w:r>
-            <w:proofErr w:type="spellEnd"/>
-            <w:r>
-              <w:rPr>
-                <w:rFonts w:ascii="Bookman Old Style" w:eastAsia="Bookman Old Style" w:hAnsi="Bookman Old Style" w:cs="Bookman Old Style"/>
-                <w:color w:val="FF0000"/>
-                <w:sz w:val="24"/>
-                <w:szCs w:val="24"/>
-              </w:rPr>
-              <w:t>}}</w:t>
+              <w:t>{{nama_lengkap}}</w:t>
             </w:r>
           </w:p>
         </w:tc>
@@ -2880,79 +913,7 @@
           <w:sz w:val="24"/>
           <w:szCs w:val="24"/>
         </w:rPr>
-        <w:t xml:space="preserve">Surat </w:t>
-      </w:r>
-      <w:proofErr w:type="spellStart"/>
-      <w:r>
-        <w:rPr>
-          <w:rFonts w:ascii="Bookman Old Style" w:eastAsia="Bookman Old Style" w:hAnsi="Bookman Old Style" w:cs="Bookman Old Style"/>
-          <w:sz w:val="24"/>
-          <w:szCs w:val="24"/>
-        </w:rPr>
-        <w:t>Pernyataan</w:t>
-      </w:r>
-      <w:proofErr w:type="spellEnd"/>
-      <w:r>
-        <w:rPr>
-          <w:rFonts w:ascii="Bookman Old Style" w:eastAsia="Bookman Old Style" w:hAnsi="Bookman Old Style" w:cs="Bookman Old Style"/>
-          <w:sz w:val="24"/>
-          <w:szCs w:val="24"/>
-        </w:rPr>
-        <w:t xml:space="preserve"> </w:t>
-      </w:r>
-      <w:proofErr w:type="spellStart"/>
-      <w:r>
-        <w:rPr>
-          <w:rFonts w:ascii="Bookman Old Style" w:eastAsia="Bookman Old Style" w:hAnsi="Bookman Old Style" w:cs="Bookman Old Style"/>
-          <w:sz w:val="24"/>
-          <w:szCs w:val="24"/>
-        </w:rPr>
-        <w:t>Penyelesaian</w:t>
-      </w:r>
-      <w:proofErr w:type="spellEnd"/>
-      <w:r>
-        <w:rPr>
-          <w:rFonts w:ascii="Bookman Old Style" w:eastAsia="Bookman Old Style" w:hAnsi="Bookman Old Style" w:cs="Bookman Old Style"/>
-          <w:sz w:val="24"/>
-          <w:szCs w:val="24"/>
-        </w:rPr>
-        <w:t xml:space="preserve"> </w:t>
-      </w:r>
-      <w:proofErr w:type="spellStart"/>
-      <w:r>
-        <w:rPr>
-          <w:rFonts w:ascii="Bookman Old Style" w:eastAsia="Bookman Old Style" w:hAnsi="Bookman Old Style" w:cs="Bookman Old Style"/>
-          <w:sz w:val="24"/>
-          <w:szCs w:val="24"/>
-        </w:rPr>
-        <w:t>Pemeriksaan</w:t>
-      </w:r>
-      <w:proofErr w:type="spellEnd"/>
-      <w:r>
-        <w:rPr>
-          <w:rFonts w:ascii="Bookman Old Style" w:eastAsia="Bookman Old Style" w:hAnsi="Bookman Old Style" w:cs="Bookman Old Style"/>
-          <w:sz w:val="24"/>
-          <w:szCs w:val="24"/>
-        </w:rPr>
-        <w:t xml:space="preserve"> </w:t>
-      </w:r>
-      <w:proofErr w:type="spellStart"/>
-      <w:r>
-        <w:rPr>
-          <w:rFonts w:ascii="Bookman Old Style" w:eastAsia="Bookman Old Style" w:hAnsi="Bookman Old Style" w:cs="Bookman Old Style"/>
-          <w:sz w:val="24"/>
-          <w:szCs w:val="24"/>
-        </w:rPr>
-        <w:t>Lapangan</w:t>
-      </w:r>
-      <w:proofErr w:type="spellEnd"/>
-      <w:r>
-        <w:rPr>
-          <w:rFonts w:ascii="Bookman Old Style" w:eastAsia="Bookman Old Style" w:hAnsi="Bookman Old Style" w:cs="Bookman Old Style"/>
-          <w:sz w:val="24"/>
-          <w:szCs w:val="24"/>
-        </w:rPr>
-        <w:t xml:space="preserve"> Sensus Ekonomi 2026 </w:t>
+        <w:t xml:space="preserve">Surat Pernyataan Penyelesaian Pemeriksaan Lapangan Sensus Ekonomi 2026 </w:t>
       </w:r>
       <w:r>
         <w:rPr>
@@ -2974,50 +935,40 @@
           <w:szCs w:val="24"/>
         </w:rPr>
       </w:pPr>
-      <w:proofErr w:type="spellStart"/>
-      <w:r>
-        <w:rPr>
-          <w:rFonts w:ascii="Bookman Old Style" w:eastAsia="Bookman Old Style" w:hAnsi="Bookman Old Style" w:cs="Bookman Old Style"/>
-          <w:sz w:val="24"/>
-          <w:szCs w:val="24"/>
-        </w:rPr>
-        <w:t>Nomor</w:t>
-      </w:r>
-      <w:proofErr w:type="spellEnd"/>
-      <w:r>
-        <w:rPr>
-          <w:rFonts w:ascii="Bookman Old Style" w:eastAsia="Bookman Old Style" w:hAnsi="Bookman Old Style" w:cs="Bookman Old Style"/>
-          <w:sz w:val="24"/>
-          <w:szCs w:val="24"/>
-        </w:rPr>
-        <w:t xml:space="preserve"> </w:t>
-      </w:r>
-      <w:r>
-        <w:rPr>
-          <w:rFonts w:ascii="Bookman Old Style" w:eastAsia="Bookman Old Style" w:hAnsi="Bookman Old Style" w:cs="Bookman Old Style"/>
-          <w:color w:val="FF0000"/>
-          <w:sz w:val="24"/>
-          <w:szCs w:val="24"/>
-        </w:rPr>
-        <w:t>{{no_urut_spp</w:t>
-      </w:r>
-      <w:r>
-        <w:rPr>
-          <w:rFonts w:ascii="Bookman Old Style" w:eastAsia="Bookman Old Style" w:hAnsi="Bookman Old Style" w:cs="Bookman Old Style"/>
-          <w:color w:val="FF0000"/>
-          <w:sz w:val="24"/>
-          <w:szCs w:val="24"/>
-        </w:rPr>
-        <w:t>_t2</w:t>
-      </w:r>
-      <w:r>
-        <w:rPr>
-          <w:rFonts w:ascii="Bookman Old Style" w:eastAsia="Bookman Old Style" w:hAnsi="Bookman Old Style" w:cs="Bookman Old Style"/>
-          <w:color w:val="FF0000"/>
-          <w:sz w:val="24"/>
-          <w:szCs w:val="24"/>
-        </w:rPr>
-        <w:t>}}</w:t>
+      <w:r>
+        <w:rPr>
+          <w:rFonts w:ascii="Bookman Old Style" w:eastAsia="Bookman Old Style" w:hAnsi="Bookman Old Style" w:cs="Bookman Old Style"/>
+          <w:sz w:val="24"/>
+          <w:szCs w:val="24"/>
+        </w:rPr>
+        <w:t xml:space="preserve">Nomor </w:t>
+      </w:r>
+      <w:r>
+        <w:rPr>
+          <w:rFonts w:ascii="Bookman Old Style" w:eastAsia="Bookman Old Style" w:hAnsi="Bookman Old Style" w:cs="Bookman Old Style"/>
+          <w:color w:val="EE0000"/>
+          <w:sz w:val="24"/>
+          <w:szCs w:val="24"/>
+        </w:rPr>
+        <w:t>{{no_</w:t>
+      </w:r>
+      <w:r>
+        <w:rPr>
+          <w:rFonts w:ascii="Bookman Old Style" w:eastAsia="Bookman Old Style" w:hAnsi="Bookman Old Style" w:cs="Bookman Old Style"/>
+          <w:color w:val="EE0000"/>
+          <w:sz w:val="24"/>
+          <w:szCs w:val="24"/>
+        </w:rPr>
+        <w:t>urut</w:t>
+      </w:r>
+      <w:r>
+        <w:rPr>
+          <w:rFonts w:ascii="Bookman Old Style" w:eastAsia="Bookman Old Style" w:hAnsi="Bookman Old Style" w:cs="Bookman Old Style"/>
+          <w:color w:val="EE0000"/>
+          <w:sz w:val="24"/>
+          <w:szCs w:val="24"/>
+        </w:rPr>
+        <w:t>_spp_t2}}</w:t>
       </w:r>
       <w:r>
         <w:rPr>
@@ -3058,79 +1009,7 @@
           <w:sz w:val="24"/>
           <w:szCs w:val="24"/>
         </w:rPr>
-        <w:t xml:space="preserve">Daftar Hasil </w:t>
-      </w:r>
-      <w:proofErr w:type="spellStart"/>
-      <w:r>
-        <w:rPr>
-          <w:rFonts w:ascii="Bookman Old Style" w:eastAsia="Bookman Old Style" w:hAnsi="Bookman Old Style" w:cs="Bookman Old Style"/>
-          <w:sz w:val="24"/>
-          <w:szCs w:val="24"/>
-        </w:rPr>
-        <w:t>Pekerjaan</w:t>
-      </w:r>
-      <w:proofErr w:type="spellEnd"/>
-      <w:r>
-        <w:rPr>
-          <w:rFonts w:ascii="Bookman Old Style" w:eastAsia="Bookman Old Style" w:hAnsi="Bookman Old Style" w:cs="Bookman Old Style"/>
-          <w:sz w:val="24"/>
-          <w:szCs w:val="24"/>
-        </w:rPr>
-        <w:t xml:space="preserve"> </w:t>
-      </w:r>
-      <w:proofErr w:type="spellStart"/>
-      <w:r>
-        <w:rPr>
-          <w:rFonts w:ascii="Bookman Old Style" w:eastAsia="Bookman Old Style" w:hAnsi="Bookman Old Style" w:cs="Bookman Old Style"/>
-          <w:sz w:val="24"/>
-          <w:szCs w:val="24"/>
-        </w:rPr>
-        <w:t>Penyelesaian</w:t>
-      </w:r>
-      <w:proofErr w:type="spellEnd"/>
-      <w:r>
-        <w:rPr>
-          <w:rFonts w:ascii="Bookman Old Style" w:eastAsia="Bookman Old Style" w:hAnsi="Bookman Old Style" w:cs="Bookman Old Style"/>
-          <w:sz w:val="24"/>
-          <w:szCs w:val="24"/>
-        </w:rPr>
-        <w:t xml:space="preserve"> </w:t>
-      </w:r>
-      <w:proofErr w:type="spellStart"/>
-      <w:r>
-        <w:rPr>
-          <w:rFonts w:ascii="Bookman Old Style" w:eastAsia="Bookman Old Style" w:hAnsi="Bookman Old Style" w:cs="Bookman Old Style"/>
-          <w:sz w:val="24"/>
-          <w:szCs w:val="24"/>
-        </w:rPr>
-        <w:t>Pemeriksaan</w:t>
-      </w:r>
-      <w:proofErr w:type="spellEnd"/>
-      <w:r>
-        <w:rPr>
-          <w:rFonts w:ascii="Bookman Old Style" w:eastAsia="Bookman Old Style" w:hAnsi="Bookman Old Style" w:cs="Bookman Old Style"/>
-          <w:sz w:val="24"/>
-          <w:szCs w:val="24"/>
-        </w:rPr>
-        <w:t xml:space="preserve"> </w:t>
-      </w:r>
-      <w:proofErr w:type="spellStart"/>
-      <w:r>
-        <w:rPr>
-          <w:rFonts w:ascii="Bookman Old Style" w:eastAsia="Bookman Old Style" w:hAnsi="Bookman Old Style" w:cs="Bookman Old Style"/>
-          <w:sz w:val="24"/>
-          <w:szCs w:val="24"/>
-        </w:rPr>
-        <w:t>Lapangan</w:t>
-      </w:r>
-      <w:proofErr w:type="spellEnd"/>
-      <w:r>
-        <w:rPr>
-          <w:rFonts w:ascii="Bookman Old Style" w:eastAsia="Bookman Old Style" w:hAnsi="Bookman Old Style" w:cs="Bookman Old Style"/>
-          <w:sz w:val="24"/>
-          <w:szCs w:val="24"/>
-        </w:rPr>
-        <w:t xml:space="preserve"> </w:t>
+        <w:t xml:space="preserve">Daftar Hasil Pekerjaan Penyelesaian Pemeriksaan Lapangan </w:t>
       </w:r>
       <w:r>
         <w:rPr>
@@ -3166,8 +1045,8 @@
     <w:tbl>
       <w:tblPr>
         <w:tblStyle w:val="a4"/>
-        <w:tblpPr w:leftFromText="180" w:rightFromText="180" w:topFromText="180" w:bottomFromText="180" w:vertAnchor="text" w:tblpX="1125"/>
-        <w:tblW w:w="10620" w:type="dxa"/>
+        <w:tblpPr w:leftFromText="180" w:rightFromText="180" w:topFromText="180" w:bottomFromText="180" w:vertAnchor="text" w:tblpX="2465"/>
+        <w:tblW w:w="9990" w:type="dxa"/>
         <w:tblInd w:w="0" w:type="dxa"/>
         <w:tblBorders>
           <w:top w:val="nil"/>
@@ -3181,12 +1060,12 @@
         <w:tblLook w:val="0600" w:firstRow="0" w:lastRow="0" w:firstColumn="0" w:lastColumn="0" w:noHBand="1" w:noVBand="1"/>
       </w:tblPr>
       <w:tblGrid>
-        <w:gridCol w:w="930"/>
-        <w:gridCol w:w="3630"/>
+        <w:gridCol w:w="1080"/>
+        <w:gridCol w:w="2140"/>
         <w:gridCol w:w="1635"/>
         <w:gridCol w:w="2325"/>
         <w:gridCol w:w="1995"/>
-        <w:gridCol w:w="105"/>
+        <w:gridCol w:w="815"/>
       </w:tblGrid>
       <w:tr>
         <w:trPr>
@@ -3194,7 +1073,7 @@
         </w:trPr>
         <w:tc>
           <w:tcPr>
-            <w:tcW w:w="930" w:type="dxa"/>
+            <w:tcW w:w="1080" w:type="dxa"/>
             <w:tcBorders>
               <w:top w:val="single" w:sz="4" w:space="0" w:color="000000"/>
               <w:left w:val="single" w:sz="4" w:space="0" w:color="000000"/>
@@ -3231,7 +1110,7 @@
         </w:tc>
         <w:tc>
           <w:tcPr>
-            <w:tcW w:w="3630" w:type="dxa"/>
+            <w:tcW w:w="2140" w:type="dxa"/>
             <w:tcBorders>
               <w:top w:val="single" w:sz="4" w:space="0" w:color="000000"/>
               <w:left w:val="single" w:sz="4" w:space="0" w:color="000000"/>
@@ -3262,36 +1141,8 @@
                 <w:sz w:val="24"/>
                 <w:szCs w:val="24"/>
               </w:rPr>
-              <w:t xml:space="preserve">Nama </w:t>
+              <w:t>Nama Petugas Lapangan</w:t>
             </w:r>
-            <w:proofErr w:type="spellStart"/>
-            <w:r>
-              <w:rPr>
-                <w:rFonts w:ascii="Bookman Old Style" w:eastAsia="Bookman Old Style" w:hAnsi="Bookman Old Style" w:cs="Bookman Old Style"/>
-                <w:sz w:val="24"/>
-                <w:szCs w:val="24"/>
-              </w:rPr>
-              <w:t>Petugas</w:t>
-            </w:r>
-            <w:proofErr w:type="spellEnd"/>
-            <w:r>
-              <w:rPr>
-                <w:rFonts w:ascii="Bookman Old Style" w:eastAsia="Bookman Old Style" w:hAnsi="Bookman Old Style" w:cs="Bookman Old Style"/>
-                <w:sz w:val="24"/>
-                <w:szCs w:val="24"/>
-              </w:rPr>
-              <w:t xml:space="preserve"> </w:t>
-            </w:r>
-            <w:proofErr w:type="spellStart"/>
-            <w:r>
-              <w:rPr>
-                <w:rFonts w:ascii="Bookman Old Style" w:eastAsia="Bookman Old Style" w:hAnsi="Bookman Old Style" w:cs="Bookman Old Style"/>
-                <w:sz w:val="24"/>
-                <w:szCs w:val="24"/>
-              </w:rPr>
-              <w:t>Lapangan</w:t>
-            </w:r>
-            <w:proofErr w:type="spellEnd"/>
           </w:p>
         </w:tc>
         <w:tc>
@@ -3369,59 +1220,13 @@
                 <w:szCs w:val="24"/>
               </w:rPr>
             </w:pPr>
-            <w:proofErr w:type="spellStart"/>
             <w:r>
               <w:rPr>
                 <w:rFonts w:ascii="Bookman Old Style" w:eastAsia="Bookman Old Style" w:hAnsi="Bookman Old Style" w:cs="Bookman Old Style"/>
                 <w:sz w:val="24"/>
                 <w:szCs w:val="24"/>
               </w:rPr>
-              <w:t>Realisasi</w:t>
-            </w:r>
-            <w:proofErr w:type="spellEnd"/>
-            <w:r>
-              <w:rPr>
-                <w:rFonts w:ascii="Bookman Old Style" w:eastAsia="Bookman Old Style" w:hAnsi="Bookman Old Style" w:cs="Bookman Old Style"/>
-                <w:sz w:val="24"/>
-                <w:szCs w:val="24"/>
-              </w:rPr>
-              <w:t xml:space="preserve"> Hasil </w:t>
-            </w:r>
-            <w:proofErr w:type="spellStart"/>
-            <w:r>
-              <w:rPr>
-                <w:rFonts w:ascii="Bookman Old Style" w:eastAsia="Bookman Old Style" w:hAnsi="Bookman Old Style" w:cs="Bookman Old Style"/>
-                <w:sz w:val="24"/>
-                <w:szCs w:val="24"/>
-              </w:rPr>
-              <w:t>Pendataan</w:t>
-            </w:r>
-            <w:proofErr w:type="spellEnd"/>
-            <w:r>
-              <w:rPr>
-                <w:rFonts w:ascii="Bookman Old Style" w:eastAsia="Bookman Old Style" w:hAnsi="Bookman Old Style" w:cs="Bookman Old Style"/>
-                <w:sz w:val="24"/>
-                <w:szCs w:val="24"/>
-              </w:rPr>
-              <w:t xml:space="preserve"> (</w:t>
-            </w:r>
-            <w:proofErr w:type="spellStart"/>
-            <w:r>
-              <w:rPr>
-                <w:rFonts w:ascii="Bookman Old Style" w:eastAsia="Bookman Old Style" w:hAnsi="Bookman Old Style" w:cs="Bookman Old Style"/>
-                <w:sz w:val="24"/>
-                <w:szCs w:val="24"/>
-              </w:rPr>
-              <w:t>Usaha+Keluarga</w:t>
-            </w:r>
-            <w:proofErr w:type="spellEnd"/>
-            <w:r>
-              <w:rPr>
-                <w:rFonts w:ascii="Bookman Old Style" w:eastAsia="Bookman Old Style" w:hAnsi="Bookman Old Style" w:cs="Bookman Old Style"/>
-                <w:sz w:val="24"/>
-                <w:szCs w:val="24"/>
-              </w:rPr>
-              <w:t>)</w:t>
+              <w:t>Realisasi Hasil Pendataan (Usaha+Keluarga)</w:t>
             </w:r>
           </w:p>
         </w:tc>
@@ -3451,29 +1256,19 @@
                 <w:szCs w:val="24"/>
               </w:rPr>
             </w:pPr>
-            <w:proofErr w:type="spellStart"/>
             <w:r>
               <w:rPr>
                 <w:rFonts w:ascii="Bookman Old Style" w:eastAsia="Bookman Old Style" w:hAnsi="Bookman Old Style" w:cs="Bookman Old Style"/>
                 <w:sz w:val="24"/>
                 <w:szCs w:val="24"/>
               </w:rPr>
-              <w:t>Presentase</w:t>
-            </w:r>
-            <w:proofErr w:type="spellEnd"/>
-            <w:r>
-              <w:rPr>
-                <w:rFonts w:ascii="Bookman Old Style" w:eastAsia="Bookman Old Style" w:hAnsi="Bookman Old Style" w:cs="Bookman Old Style"/>
-                <w:sz w:val="24"/>
-                <w:szCs w:val="24"/>
-              </w:rPr>
-              <w:t xml:space="preserve"> (%)</w:t>
+              <w:t>Presentase (%)</w:t>
             </w:r>
           </w:p>
         </w:tc>
         <w:tc>
           <w:tcPr>
-            <w:tcW w:w="105" w:type="dxa"/>
+            <w:tcW w:w="815" w:type="dxa"/>
             <w:tcBorders>
               <w:left w:val="single" w:sz="4" w:space="0" w:color="000000"/>
             </w:tcBorders>
@@ -3503,7 +1298,7 @@
         </w:trPr>
         <w:tc>
           <w:tcPr>
-            <w:tcW w:w="930" w:type="dxa"/>
+            <w:tcW w:w="1080" w:type="dxa"/>
             <w:tcBorders>
               <w:top w:val="single" w:sz="4" w:space="0" w:color="000000"/>
               <w:left w:val="single" w:sz="4" w:space="0" w:color="000000"/>
@@ -3540,7 +1335,7 @@
         </w:tc>
         <w:tc>
           <w:tcPr>
-            <w:tcW w:w="3630" w:type="dxa"/>
+            <w:tcW w:w="2140" w:type="dxa"/>
             <w:tcBorders>
               <w:top w:val="single" w:sz="4" w:space="0" w:color="000000"/>
               <w:left w:val="single" w:sz="4" w:space="0" w:color="000000"/>
@@ -3686,7 +1481,7 @@
         </w:tc>
         <w:tc>
           <w:tcPr>
-            <w:tcW w:w="105" w:type="dxa"/>
+            <w:tcW w:w="815" w:type="dxa"/>
             <w:tcBorders>
               <w:left w:val="single" w:sz="4" w:space="0" w:color="000000"/>
             </w:tcBorders>
@@ -3725,7 +1520,7 @@
         </w:trPr>
         <w:tc>
           <w:tcPr>
-            <w:tcW w:w="930" w:type="dxa"/>
+            <w:tcW w:w="1080" w:type="dxa"/>
             <w:tcBorders>
               <w:top w:val="single" w:sz="4" w:space="0" w:color="000000"/>
               <w:left w:val="single" w:sz="4" w:space="0" w:color="000000"/>
@@ -3762,7 +1557,7 @@
         </w:tc>
         <w:tc>
           <w:tcPr>
-            <w:tcW w:w="3630" w:type="dxa"/>
+            <w:tcW w:w="2140" w:type="dxa"/>
             <w:tcBorders>
               <w:top w:val="single" w:sz="4" w:space="0" w:color="000000"/>
               <w:left w:val="single" w:sz="4" w:space="0" w:color="000000"/>
@@ -3898,7 +1693,7 @@
         </w:tc>
         <w:tc>
           <w:tcPr>
-            <w:tcW w:w="105" w:type="dxa"/>
+            <w:tcW w:w="815" w:type="dxa"/>
             <w:tcBorders>
               <w:left w:val="single" w:sz="4" w:space="0" w:color="000000"/>
             </w:tcBorders>
@@ -3928,7 +1723,7 @@
         </w:trPr>
         <w:tc>
           <w:tcPr>
-            <w:tcW w:w="930" w:type="dxa"/>
+            <w:tcW w:w="1080" w:type="dxa"/>
             <w:tcBorders>
               <w:top w:val="single" w:sz="4" w:space="0" w:color="000000"/>
               <w:left w:val="single" w:sz="4" w:space="0" w:color="000000"/>
@@ -3980,7 +1775,7 @@
         </w:tc>
         <w:tc>
           <w:tcPr>
-            <w:tcW w:w="3630" w:type="dxa"/>
+            <w:tcW w:w="2140" w:type="dxa"/>
             <w:tcBorders>
               <w:top w:val="single" w:sz="4" w:space="0" w:color="000000"/>
               <w:left w:val="single" w:sz="4" w:space="0" w:color="000000"/>
@@ -4124,7 +1919,7 @@
         </w:tc>
         <w:tc>
           <w:tcPr>
-            <w:tcW w:w="105" w:type="dxa"/>
+            <w:tcW w:w="815" w:type="dxa"/>
             <w:tcBorders>
               <w:left w:val="single" w:sz="4" w:space="0" w:color="000000"/>
             </w:tcBorders>
@@ -4154,7 +1949,7 @@
         </w:trPr>
         <w:tc>
           <w:tcPr>
-            <w:tcW w:w="930" w:type="dxa"/>
+            <w:tcW w:w="1080" w:type="dxa"/>
             <w:tcBorders>
               <w:top w:val="single" w:sz="4" w:space="0" w:color="000000"/>
               <w:left w:val="single" w:sz="4" w:space="0" w:color="000000"/>
@@ -4206,7 +2001,7 @@
         </w:tc>
         <w:tc>
           <w:tcPr>
-            <w:tcW w:w="3630" w:type="dxa"/>
+            <w:tcW w:w="2140" w:type="dxa"/>
             <w:tcBorders>
               <w:top w:val="single" w:sz="4" w:space="0" w:color="000000"/>
               <w:left w:val="single" w:sz="4" w:space="0" w:color="000000"/>
@@ -4350,7 +2145,7 @@
         </w:tc>
         <w:tc>
           <w:tcPr>
-            <w:tcW w:w="105" w:type="dxa"/>
+            <w:tcW w:w="815" w:type="dxa"/>
             <w:tcBorders>
               <w:left w:val="single" w:sz="4" w:space="0" w:color="000000"/>
             </w:tcBorders>
@@ -4380,7 +2175,7 @@
         </w:trPr>
         <w:tc>
           <w:tcPr>
-            <w:tcW w:w="4560" w:type="dxa"/>
+            <w:tcW w:w="3220" w:type="dxa"/>
             <w:gridSpan w:val="2"/>
             <w:tcBorders>
               <w:top w:val="single" w:sz="4" w:space="0" w:color="000000"/>
@@ -4405,7 +2200,6 @@
                 <w:szCs w:val="24"/>
               </w:rPr>
             </w:pPr>
-            <w:proofErr w:type="spellStart"/>
             <w:r>
               <w:rPr>
                 <w:rFonts w:ascii="Bookman Old Style" w:eastAsia="Bookman Old Style" w:hAnsi="Bookman Old Style" w:cs="Bookman Old Style"/>
@@ -4414,7 +2208,6 @@
               </w:rPr>
               <w:t>Jumlah</w:t>
             </w:r>
-            <w:proofErr w:type="spellEnd"/>
           </w:p>
         </w:tc>
         <w:tc>
@@ -4518,7 +2311,7 @@
         </w:tc>
         <w:tc>
           <w:tcPr>
-            <w:tcW w:w="105" w:type="dxa"/>
+            <w:tcW w:w="815" w:type="dxa"/>
             <w:tcBorders>
               <w:left w:val="single" w:sz="4" w:space="0" w:color="000000"/>
             </w:tcBorders>
@@ -4587,43 +2380,7 @@
           <w:szCs w:val="24"/>
         </w:rPr>
         <w:lastRenderedPageBreak/>
-        <w:t xml:space="preserve">Yang </w:t>
-      </w:r>
-      <w:proofErr w:type="spellStart"/>
-      <w:r>
-        <w:rPr>
-          <w:rFonts w:ascii="Bookman Old Style" w:eastAsia="Bookman Old Style" w:hAnsi="Bookman Old Style" w:cs="Bookman Old Style"/>
-          <w:sz w:val="24"/>
-          <w:szCs w:val="24"/>
-        </w:rPr>
-        <w:t>membuat</w:t>
-      </w:r>
-      <w:proofErr w:type="spellEnd"/>
-      <w:r>
-        <w:rPr>
-          <w:rFonts w:ascii="Bookman Old Style" w:eastAsia="Bookman Old Style" w:hAnsi="Bookman Old Style" w:cs="Bookman Old Style"/>
-          <w:sz w:val="24"/>
-          <w:szCs w:val="24"/>
-        </w:rPr>
-        <w:t xml:space="preserve"> </w:t>
-      </w:r>
-      <w:proofErr w:type="spellStart"/>
-      <w:r>
-        <w:rPr>
-          <w:rFonts w:ascii="Bookman Old Style" w:eastAsia="Bookman Old Style" w:hAnsi="Bookman Old Style" w:cs="Bookman Old Style"/>
-          <w:sz w:val="24"/>
-          <w:szCs w:val="24"/>
-        </w:rPr>
-        <w:t>pernyataan</w:t>
-      </w:r>
-      <w:proofErr w:type="spellEnd"/>
-      <w:r>
-        <w:rPr>
-          <w:rFonts w:ascii="Bookman Old Style" w:eastAsia="Bookman Old Style" w:hAnsi="Bookman Old Style" w:cs="Bookman Old Style"/>
-          <w:sz w:val="24"/>
-          <w:szCs w:val="24"/>
-        </w:rPr>
-        <w:t>,</w:t>
+        <w:t>Yang membuat pernyataan,</w:t>
       </w:r>
     </w:p>
     <w:p>
@@ -4693,27 +2450,7 @@
           <w:sz w:val="24"/>
           <w:szCs w:val="24"/>
         </w:rPr>
-        <w:t>{{</w:t>
-      </w:r>
-      <w:proofErr w:type="spellStart"/>
-      <w:r>
-        <w:rPr>
-          <w:rFonts w:ascii="Bookman Old Style" w:eastAsia="Bookman Old Style" w:hAnsi="Bookman Old Style" w:cs="Bookman Old Style"/>
-          <w:color w:val="FF0000"/>
-          <w:sz w:val="24"/>
-          <w:szCs w:val="24"/>
-        </w:rPr>
-        <w:t>nama_lengkap</w:t>
-      </w:r>
-      <w:proofErr w:type="spellEnd"/>
-      <w:r>
-        <w:rPr>
-          <w:rFonts w:ascii="Bookman Old Style" w:eastAsia="Bookman Old Style" w:hAnsi="Bookman Old Style" w:cs="Bookman Old Style"/>
-          <w:color w:val="FF0000"/>
-          <w:sz w:val="24"/>
-          <w:szCs w:val="24"/>
-        </w:rPr>
-        <w:t xml:space="preserve">}} </w:t>
+        <w:t xml:space="preserve">{{nama_lengkap}} </w:t>
       </w:r>
     </w:p>
     <w:p>
@@ -4727,23 +2464,13 @@
           <w:szCs w:val="24"/>
         </w:rPr>
       </w:pPr>
-      <w:proofErr w:type="spellStart"/>
-      <w:r>
-        <w:rPr>
-          <w:rFonts w:ascii="Bookman Old Style" w:eastAsia="Bookman Old Style" w:hAnsi="Bookman Old Style" w:cs="Bookman Old Style"/>
-          <w:sz w:val="24"/>
-          <w:szCs w:val="24"/>
-        </w:rPr>
-        <w:t>Mengetahui</w:t>
-      </w:r>
-      <w:proofErr w:type="spellEnd"/>
-      <w:r>
-        <w:rPr>
-          <w:rFonts w:ascii="Bookman Old Style" w:eastAsia="Bookman Old Style" w:hAnsi="Bookman Old Style" w:cs="Bookman Old Style"/>
-          <w:sz w:val="24"/>
-          <w:szCs w:val="24"/>
-        </w:rPr>
-        <w:t>,</w:t>
+      <w:r>
+        <w:rPr>
+          <w:rFonts w:ascii="Bookman Old Style" w:eastAsia="Bookman Old Style" w:hAnsi="Bookman Old Style" w:cs="Bookman Old Style"/>
+          <w:sz w:val="24"/>
+          <w:szCs w:val="24"/>
+        </w:rPr>
+        <w:t>Mengetahui,</w:t>
       </w:r>
     </w:p>
     <w:p>
@@ -4757,23 +2484,13 @@
           <w:szCs w:val="24"/>
         </w:rPr>
       </w:pPr>
-      <w:proofErr w:type="spellStart"/>
-      <w:r>
-        <w:rPr>
-          <w:rFonts w:ascii="Bookman Old Style" w:eastAsia="Bookman Old Style" w:hAnsi="Bookman Old Style" w:cs="Bookman Old Style"/>
-          <w:sz w:val="24"/>
-          <w:szCs w:val="24"/>
-        </w:rPr>
-        <w:t>Ketua</w:t>
-      </w:r>
-      <w:proofErr w:type="spellEnd"/>
-      <w:r>
-        <w:rPr>
-          <w:rFonts w:ascii="Bookman Old Style" w:eastAsia="Bookman Old Style" w:hAnsi="Bookman Old Style" w:cs="Bookman Old Style"/>
-          <w:sz w:val="24"/>
-          <w:szCs w:val="24"/>
-        </w:rPr>
-        <w:t xml:space="preserve"> Tim Pelaksana Sensus Ekonomi 2026</w:t>
+      <w:r>
+        <w:rPr>
+          <w:rFonts w:ascii="Bookman Old Style" w:eastAsia="Bookman Old Style" w:hAnsi="Bookman Old Style" w:cs="Bookman Old Style"/>
+          <w:sz w:val="24"/>
+          <w:szCs w:val="24"/>
+        </w:rPr>
+        <w:t>Ketua Tim Pelaksana Sensus Ekonomi 2026</w:t>
       </w:r>
     </w:p>
     <w:p>
@@ -4788,7 +2505,6 @@
           <w:szCs w:val="24"/>
         </w:rPr>
       </w:pPr>
-      <w:proofErr w:type="spellStart"/>
       <w:r>
         <w:rPr>
           <w:rFonts w:ascii="Bookman Old Style" w:eastAsia="Bookman Old Style" w:hAnsi="Bookman Old Style" w:cs="Bookman Old Style"/>
@@ -4796,17 +2512,7 @@
           <w:sz w:val="24"/>
           <w:szCs w:val="24"/>
         </w:rPr>
-        <w:t>Kabupaten</w:t>
-      </w:r>
-      <w:proofErr w:type="spellEnd"/>
-      <w:r>
-        <w:rPr>
-          <w:rFonts w:ascii="Bookman Old Style" w:eastAsia="Bookman Old Style" w:hAnsi="Bookman Old Style" w:cs="Bookman Old Style"/>
-          <w:color w:val="0000FF"/>
-          <w:sz w:val="24"/>
-          <w:szCs w:val="24"/>
-        </w:rPr>
-        <w:t xml:space="preserve"> Barito Kuala</w:t>
+        <w:t>Kabupaten Barito Kuala</w:t>
       </w:r>
     </w:p>
     <w:p>

</xml_diff>